<commit_message>
ADG: 15장 보강 — Logical Standby 모니터링(V$LOGSTDBY_TRANSACTION)
실습 주제 목록의 마지막 미이행 항목(15장 6번)을 실측해 반영한다.

- 본문에 15.6 "Logical Standby 는 다른 뷰로 본다" 신설
  (기존 15.6~15.9 를 15.7~15.10 으로 이동)
- 실습 07 트랜스크립트 추가 — 전환·모니터링·복구 전 과정
- 객관식 [중-20]·[상-10], 서술형 [추가-17] 을 이 주제로 교체
- PPT 40 → 44장

주요 실측
- Logical 로 바뀌면 V$MANAGED_STANDBY 에 MRP0 이 없고
  V$DATAGUARD_STATS 는 no rows selected — 두 지연이 통째로 사라진다
- V$LOGSTDBY_TRANSACTION 의 열은 전부 PRIMARY_ 접두어이며
  XIDUSN·SAVEPOINT_SCN·COMMIT_SCN 은 19c 에 없다 (ORA-00904)
- 이 뷰는 SQL Apply 가 도는 동안에만 채워진다.
  멈춘 뒤의 XID 는 DBA_LOGSTDBY_EVENTS 에서 찾는다 (열 이름은 XIDUSN)
- 적용 중단 재현은 ORA-26787, SKIP_TRANSACTION 은 PDB 에서 ORA-65040,
  정지 상태에서 ORA-16104 로 거부 — 원인 제거로 복구
- REMOVE CONFIGURATION 이 log_archive_config·fal_server 를 덮어
  전송이 끊긴다 (ORA-16057)

본문 29,997자, verify 21/21. 환경은 ch16-done 스냅샷으로 원복.

Co-Authored-By: Claude Opus 5 (1M context) <noreply@anthropic.com>
</commit_message>
<xml_diff>
--- a/ADG/15장/15장_V뷰기반모니터링과문제해결.docx
+++ b/ADG/15장/15장_V뷰기반모니터링과문제해결.docx
@@ -159,6 +159,18 @@
           <w:rFonts w:ascii="맑은 고딕" w:hAnsi="맑은 고딕" w:eastAsia="맑은 고딕"/>
           <w:sz w:val="21"/>
         </w:rPr>
+        <w:t>Logical Standby에서 어떤 뷰가 비는지 알고 `V$LOGSTDBY_TRANSACTION`으로 적용 중인 트랜잭션을 추적한다.</w:t>
+      </w:r>
+    </w:p>
+    <w:p>
+      <w:pPr>
+        <w:pStyle w:val="ListBullet"/>
+      </w:pPr>
+      <w:r>
+        <w:rPr>
+          <w:rFonts w:ascii="맑은 고딕" w:hAnsi="맑은 고딕" w:eastAsia="맑은 고딕"/>
+          <w:sz w:val="21"/>
+        </w:rPr>
         <w:t>위 지표를 한 번에 수집하는 상시 점검 스크립트를 만든다.</w:t>
       </w:r>
     </w:p>
@@ -613,7 +625,7 @@
           <w:rFonts w:ascii="맑은 고딕" w:hAnsi="맑은 고딕" w:eastAsia="맑은 고딕"/>
           <w:sz w:val="21"/>
         </w:rPr>
-        <w:t>**`SEQUENCE#`가 전부 0**이다. Standby는 자기 온라인 리두에 아무것도 쓰지 않는다. 리두는 Primary가 만들고 Standby는 받기만 한다.</w:t>
+        <w:t>**`SEQUENCE#`가 전부 0**이다. Standby는 자기 온라인 리두에 아무것도 쓰지 않는다. 있는 이유는 **역할이 바뀐 뒤에 쓰기 위해서**이며, 14장의 `VERBOSE`가 `Future` 구성에서 계산한 것이 이 그룹들이다.</w:t>
       </w:r>
     </w:p>
     <w:p>
@@ -622,16 +634,7 @@
           <w:rFonts w:ascii="맑은 고딕" w:hAnsi="맑은 고딕" w:eastAsia="맑은 고딕"/>
           <w:sz w:val="21"/>
         </w:rPr>
-        <w:t>그러면 왜 있는가. **역할이 바뀐 뒤에 쓰기 위해서**다. 14장의 `VERBOSE`가 `Future` 구성에서 계산한 것이 이 그룹들이며, `Not Cleared`도 같은 맥락이다.</w:t>
-      </w:r>
-    </w:p>
-    <w:p>
-      <w:r>
-        <w:rPr>
-          <w:rFonts w:ascii="맑은 고딕" w:hAnsi="맑은 고딕" w:eastAsia="맑은 고딕"/>
-          <w:sz w:val="21"/>
-        </w:rPr>
-        <w:t>파일 목록에는 다른 점이 하나 더 있다.</w:t>
+        <w:t>파일 목록에도 다른 점이 있다.</w:t>
       </w:r>
     </w:p>
     <w:tbl>
@@ -737,20 +740,7 @@
                 <w:color w:val="F2F2F2"/>
                 <w:sz w:val="19"/>
               </w:rPr>
-              <w:t xml:space="preserve">         1 ONLINE          /u03/app/oracle/fast_recovery_area/BOSTON/onlinelog/...</w:t>
-            </w:r>
-          </w:p>
-          <w:p>
-            <w:pPr>
-              <w:spacing w:after="0" w:before="0"/>
-            </w:pPr>
-            <w:r>
-              <w:rPr>
-                <w:rFonts w:ascii="Consolas" w:hAnsi="Consolas" w:eastAsia="Consolas"/>
-                <w:color w:val="F2F2F2"/>
-                <w:sz w:val="19"/>
-              </w:rPr>
-              <w:t xml:space="preserve">         ...</w:t>
+              <w:t xml:space="preserve">         1 ONLINE          /u03/.../fast_recovery_area/BOSTON/onlinelog/...</w:t>
             </w:r>
           </w:p>
           <w:p>
@@ -776,16 +766,7 @@
           <w:rFonts w:ascii="맑은 고딕" w:hAnsi="맑은 고딕" w:eastAsia="맑은 고딕"/>
           <w:sz w:val="21"/>
         </w:rPr>
-        <w:t>**그룹마다 멤버가 둘**이다. 6장에서 OMF로 복제할 때 `DB_CREATE_ONLINE_LOG_DEST_1`과 `_2`를 지정했기 때문이며 오라클이 자동으로 다중화했다. chicago는 같은 조회에서 7행이었다. 그룹당 하나씩이다.</w:t>
-      </w:r>
-    </w:p>
-    <w:p>
-      <w:r>
-        <w:rPr>
-          <w:rFonts w:ascii="맑은 고딕" w:hAnsi="맑은 고딕" w:eastAsia="맑은 고딕"/>
-          <w:sz w:val="21"/>
-        </w:rPr>
-        <w:t>**양쪽 구성이 다르다.** chicago는 손으로 만들었고 boston은 OMF가 만들었다. 동작에는 지장이 없지만 알아 두어야 한다. 역할이 바뀌면 다중화 수준도 함께 바뀐다.</w:t>
+        <w:t>**그룹마다 멤버가 둘**이다. 6장에서 OMF로 복제할 때 `DB_CREATE_ONLINE_LOG_DEST_1`과 `_2`를 지정해 자동으로 다중화됐다. chicago는 같은 조회에서 7행, 그룹당 하나였다. **양쪽 구성이 다르다.** 동작에는 지장이 없지만 역할이 바뀌면 다중화 수준도 함께 바뀐다.</w:t>
       </w:r>
     </w:p>
     <w:tbl>
@@ -834,7 +815,7 @@
                 <w:rFonts w:ascii="맑은 고딕" w:hAnsi="맑은 고딕" w:eastAsia="맑은 고딕"/>
                 <w:sz w:val="20"/>
               </w:rPr>
-              <w:t>비어 있는 것이 정상이라는 규칙은 감시 스크립트를 짤 때 유용하다. `WHERE status IS NOT NULL`인 행이 하나라도 나오면 확인 대상이다.</w:t>
+              <w:t>감시 스크립트에서는 `WHERE status IS NOT NULL`인 행이 하나라도 나오면 확인 대상이다.</w:t>
             </w:r>
           </w:p>
         </w:tc>
@@ -1013,25 +994,7 @@
           <w:rFonts w:ascii="맑은 고딕" w:hAnsi="맑은 고딕" w:eastAsia="맑은 고딕"/>
           <w:sz w:val="21"/>
         </w:rPr>
-        <w:t>`ACTIVE`는 지금 받고 있다는 뜻이고 `UNASSIGNED`는 대기 중이라는 뜻이다.</w:t>
-      </w:r>
-    </w:p>
-    <w:p>
-      <w:r>
-        <w:rPr>
-          <w:rFonts w:ascii="맑은 고딕" w:hAnsi="맑은 고딕" w:eastAsia="맑은 고딕"/>
-          <w:sz w:val="21"/>
-        </w:rPr>
-        <w:t>**정상 상태에서 `ACTIVE`는 하나뿐**이라는 것이 판정 기준이다. 둘 이상이면 앞의 것이 아직 아카이브되지 않은 채 다음 것을 받고 있다는 뜻이므로 아카이버를 확인한다.</w:t>
-      </w:r>
-    </w:p>
-    <w:p>
-      <w:r>
-        <w:rPr>
-          <w:rFonts w:ascii="맑은 고딕" w:hAnsi="맑은 고딕" w:eastAsia="맑은 고딕"/>
-          <w:sz w:val="21"/>
-        </w:rPr>
-        <w:t>하나도 없으면 리두가 오지 않고 있다는 뜻이다. **전송이 끊겼을 때 여기서 먼저 드러난다.**</w:t>
+        <w:t>`ACTIVE`는 지금 받는 중, `UNASSIGNED`는 대기 중이다. **정상 상태에서 `ACTIVE`는 하나뿐**이며, 둘 이상이면 앞의 것이 아카이브되지 않은 채 다음을 받는 것이므로 아카이버를 확인한다. 하나도 없으면 리두가 오지 않는 것이며 **전송이 끊겼을 때 여기서 먼저 드러난다.**</w:t>
       </w:r>
     </w:p>
     <w:p>
@@ -1068,7 +1031,7 @@
                 <w:color w:val="F2F2F2"/>
                 <w:sz w:val="19"/>
               </w:rPr>
-              <w:t>SYS@chicago&gt; select group#, thread#, sequence#, archived, status</w:t>
+              <w:t>SYS@chicago&gt; select group#, sequence#, archived, status</w:t>
             </w:r>
           </w:p>
           <w:p>
@@ -1107,7 +1070,7 @@
                 <w:color w:val="F2F2F2"/>
                 <w:sz w:val="19"/>
               </w:rPr>
-              <w:t xml:space="preserve">    GROUP#    THREAD#  SEQUENCE#     ARC STATUS</w:t>
+              <w:t xml:space="preserve">    GROUP#  SEQUENCE#     ARC STATUS</w:t>
             </w:r>
           </w:p>
           <w:p>
@@ -1120,7 +1083,7 @@
                 <w:color w:val="F2F2F2"/>
                 <w:sz w:val="19"/>
               </w:rPr>
-              <w:t>---------- ---------- ---------- ------- ----------</w:t>
+              <w:t>---------- ---------- ------- ----------</w:t>
             </w:r>
           </w:p>
           <w:p>
@@ -1133,7 +1096,7 @@
                 <w:color w:val="F2F2F2"/>
                 <w:sz w:val="19"/>
               </w:rPr>
-              <w:t xml:space="preserve">         4          1          0     YES UNASSIGNED</w:t>
+              <w:t xml:space="preserve">         4          0     YES UNASSIGNED</w:t>
             </w:r>
           </w:p>
           <w:p>
@@ -1146,7 +1109,7 @@
                 <w:color w:val="F2F2F2"/>
                 <w:sz w:val="19"/>
               </w:rPr>
-              <w:t xml:space="preserve">         5          1          0     YES UNASSIGNED</w:t>
+              <w:t xml:space="preserve">       ...          0     YES UNASSIGNED</w:t>
             </w:r>
           </w:p>
           <w:p>
@@ -1159,20 +1122,7 @@
                 <w:color w:val="F2F2F2"/>
                 <w:sz w:val="19"/>
               </w:rPr>
-              <w:t xml:space="preserve">         6          1          0     YES UNASSIGNED</w:t>
-            </w:r>
-          </w:p>
-          <w:p>
-            <w:pPr>
-              <w:spacing w:after="0" w:before="0"/>
-            </w:pPr>
-            <w:r>
-              <w:rPr>
-                <w:rFonts w:ascii="Consolas" w:hAnsi="Consolas" w:eastAsia="Consolas"/>
-                <w:color w:val="F2F2F2"/>
-                <w:sz w:val="19"/>
-              </w:rPr>
-              <w:t xml:space="preserve">         7          1          0     YES UNASSIGNED</w:t>
+              <w:t xml:space="preserve">         7          0     YES UNASSIGNED</w:t>
             </w:r>
           </w:p>
         </w:tc>
@@ -1194,7 +1144,7 @@
           <w:rFonts w:ascii="맑은 고딕" w:hAnsi="맑은 고딕" w:eastAsia="맑은 고딕"/>
           <w:sz w:val="21"/>
         </w:rPr>
-        <w:t>요령이 하나 나온다. **`V$STANDBY_LOG`는 Primary에서도 오류 없이 조회된다.** 감시 스크립트가 전부 `UNASSIGNED`를 받았다면, 리두를 못 받는 것이 아니라 **Primary에서 조회했을 가능성**을 먼저 의심한다.</w:t>
+        <w:t>**`V$STANDBY_LOG`는 Primary에서도 오류 없이 조회된다.** 감시 스크립트가 전부 `UNASSIGNED`를 받았다면 **Primary에서 조회했을 가능성**을 먼저 의심한다.</w:t>
       </w:r>
     </w:p>
     <w:tbl>
@@ -1231,7 +1181,7 @@
                 <w:rFonts w:ascii="맑은 고딕" w:hAnsi="맑은 고딕" w:eastAsia="맑은 고딕"/>
                 <w:sz w:val="20"/>
               </w:rPr>
-              <w:t>**①** `V$LOG`에서 `CURRENT`가 정확히 하나인지 본다.</w:t>
+              <w:t>**①** `V$LOG`에서 `CURRENT`가 정확히 하나인가. **②** `ACTIVE`이면서 `ARCHIVED=NO`인 그룹이 쌓이지 않았는가.</w:t>
             </w:r>
           </w:p>
           <w:p>
@@ -1243,7 +1193,7 @@
                 <w:rFonts w:ascii="맑은 고딕" w:hAnsi="맑은 고딕" w:eastAsia="맑은 고딕"/>
                 <w:sz w:val="20"/>
               </w:rPr>
-              <w:t>**②** `ACTIVE`이면서 `ARCHIVED=NO`인 그룹이 쌓이지 않았는지 본다.</w:t>
+              <w:t>**③** Standby의 `V$STANDBY_LOG`에서 `ACTIVE`가 정확히 하나인가. **④** 그 `SEQUENCE#`가 Primary의 `CURRENT`와 같은가. 다르면 밀린 것이다.</w:t>
             </w:r>
           </w:p>
           <w:p>
@@ -1255,31 +1205,7 @@
                 <w:rFonts w:ascii="맑은 고딕" w:hAnsi="맑은 고딕" w:eastAsia="맑은 고딕"/>
                 <w:sz w:val="20"/>
               </w:rPr>
-              <w:t>**③** Standby의 `V$STANDBY_LOG`에서 `ACTIVE`가 정확히 하나인지 본다.</w:t>
-            </w:r>
-          </w:p>
-          <w:p>
-            <w:pPr>
-              <w:spacing w:after="20"/>
-            </w:pPr>
-            <w:r>
-              <w:rPr>
-                <w:rFonts w:ascii="맑은 고딕" w:hAnsi="맑은 고딕" w:eastAsia="맑은 고딕"/>
-                <w:sz w:val="20"/>
-              </w:rPr>
-              <w:t>**④** 그 그룹의 `SEQUENCE#`가 Primary의 `CURRENT` 시퀀스와 같은지 본다. 다르면 밀린 것이다.</w:t>
-            </w:r>
-          </w:p>
-          <w:p>
-            <w:pPr>
-              <w:spacing w:after="20"/>
-            </w:pPr>
-            <w:r>
-              <w:rPr>
-                <w:rFonts w:ascii="맑은 고딕" w:hAnsi="맑은 고딕" w:eastAsia="맑은 고딕"/>
-                <w:sz w:val="20"/>
-              </w:rPr>
-              <w:t>**⑤** `V$LOGFILE`에서 `STATUS`가 비어 있지 않은 행이 있는지 본다.</w:t>
+              <w:t>**⑤** `V$LOGFILE`에서 `STATUS`가 비어 있지 않은 행이 있는가.</w:t>
             </w:r>
           </w:p>
           <w:p>
@@ -1348,19 +1274,6 @@
                 <w:color w:val="F2F2F2"/>
                 <w:sz w:val="19"/>
               </w:rPr>
-              <w:t>SYS@chicago&gt; col destination for a26</w:t>
-            </w:r>
-          </w:p>
-          <w:p>
-            <w:pPr>
-              <w:spacing w:after="0" w:before="0"/>
-            </w:pPr>
-            <w:r>
-              <w:rPr>
-                <w:rFonts w:ascii="Consolas" w:hAnsi="Consolas" w:eastAsia="Consolas"/>
-                <w:color w:val="F2F2F2"/>
-                <w:sz w:val="19"/>
-              </w:rPr>
               <w:t>SYS@chicago&gt; select dest_id, destination, status, binding, valid_now</w:t>
             </w:r>
           </w:p>
@@ -1510,7 +1423,7 @@
                 <w:color w:val="F2F2F2"/>
                 <w:sz w:val="19"/>
               </w:rPr>
-              <w:t xml:space="preserve">   DEST_ID DESTINATION  STATUS    TYPE       RECOVERY_MODE</w:t>
+              <w:t xml:space="preserve">   DEST_ID DEST     STATUS  TYPE      RECOVERY_MODE</w:t>
             </w:r>
           </w:p>
           <w:p>
@@ -1523,7 +1436,7 @@
                 <w:color w:val="F2F2F2"/>
                 <w:sz w:val="19"/>
               </w:rPr>
-              <w:t>---------- ------------ --------- ---------- ------------------------</w:t>
+              <w:t>---------- -------- ------- --------- ------------------------</w:t>
             </w:r>
           </w:p>
           <w:p>
@@ -1536,7 +1449,7 @@
                 <w:color w:val="F2F2F2"/>
                 <w:sz w:val="19"/>
               </w:rPr>
-              <w:t xml:space="preserve">         1              VALID     LOCAL      IDLE</w:t>
+              <w:t xml:space="preserve">         1          VALID   LOCAL     IDLE</w:t>
             </w:r>
           </w:p>
           <w:p>
@@ -1549,7 +1462,7 @@
                 <w:color w:val="F2F2F2"/>
                 <w:sz w:val="19"/>
               </w:rPr>
-              <w:t xml:space="preserve">         2 boston       VALID     PHYSICAL   MANAGED REAL TIME APPLY</w:t>
+              <w:t xml:space="preserve">         2 boston   VALID   PHYSICAL  MANAGED REAL TIME APPLY</w:t>
             </w:r>
           </w:p>
         </w:tc>
@@ -1713,16 +1626,7 @@
           <w:rFonts w:ascii="맑은 고딕" w:hAnsi="맑은 고딕" w:eastAsia="맑은 고딕"/>
           <w:sz w:val="21"/>
         </w:rPr>
-        <w:t>두 뷰가 같은 `STATUS` 열을 가지고 있어 혼동하기 쉽다. `RECOVERY_MODE`가 있으면 `_STATUS`이고 `VALID_NOW`가 있으면 `V$ARCHIVE_DEST`다.</w:t>
-      </w:r>
-    </w:p>
-    <w:p>
-      <w:r>
-        <w:rPr>
-          <w:rFonts w:ascii="맑은 고딕" w:hAnsi="맑은 고딕" w:eastAsia="맑은 고딕"/>
-          <w:sz w:val="21"/>
-        </w:rPr>
-        <w:t>`dest_id=1`의 `RECOVERY_MODE`가 `IDLE`인 것도 읽어 둔다. **로컬 목적지에는 적용이라는 개념이 없다.**</w:t>
+        <w:t>두 뷰가 같은 `STATUS` 열을 가져 혼동하기 쉽다. `RECOVERY_MODE`가 있으면 `_STATUS`, `VALID_NOW`가 있으면 `V$ARCHIVE_DEST`다. `dest_id=1`의 `RECOVERY_MODE`가 `IDLE`인 것은 **로컬 목적지에 적용이라는 개념이 없기** 때문이다.</w:t>
       </w:r>
     </w:p>
     <w:p>
@@ -1849,7 +1753,7 @@
           <w:rFonts w:ascii="맑은 고딕" w:hAnsi="맑은 고딕" w:eastAsia="맑은 고딕"/>
           <w:sz w:val="21"/>
         </w:rPr>
-        <w:t>7장의 `VALID_FOR`가 여기서 열로 분해되어 나타난다.</w:t>
+        <w:t>7장의 `VALID_FOR`가 열로 분해되어 나타난다.</w:t>
       </w:r>
     </w:p>
     <w:tbl>
@@ -2141,16 +2045,7 @@
           <w:rFonts w:ascii="맑은 고딕" w:hAnsi="맑은 고딕" w:eastAsia="맑은 고딕"/>
           <w:sz w:val="21"/>
         </w:rPr>
-        <w:t>**1번이 `SYNCHRONOUS`인 것이 눈에 띈다.** 로컬 디스크에 쓰는 것이므로 네트워크 전송이 아니며, 여기서의 `SYNCHRONOUS`는 프로세스가 기다린다는 뜻일 뿐이다. **보호 모드와 무관하다.**</w:t>
-      </w:r>
-    </w:p>
-    <w:p>
-      <w:r>
-        <w:rPr>
-          <w:rFonts w:ascii="맑은 고딕" w:hAnsi="맑은 고딕" w:eastAsia="맑은 고딕"/>
-          <w:sz w:val="21"/>
-        </w:rPr>
-        <w:t>2번의 `VALID_TYPE`이 `ONLINE_LOGFILE`인 것은 13장에서 Broker가 인수하며 만든 `(online_logfiles, all_roles)`가 두 열로 나뉜 것이다.</w:t>
+        <w:t>**1번이 `SYNCHRONOUS`인 것이 눈에 띈다.** 로컬 디스크에 쓰므로 네트워크 전송이 아니고 프로세스가 기다린다는 뜻일 뿐이며 **보호 모드와 무관하다.** 2번의 `VALID_TYPE`이 `ONLINE_LOGFILE`인 것은 13장에서 Broker가 만든 `(online_logfiles, all_roles)`가 두 열로 나뉜 것이다.</w:t>
       </w:r>
     </w:p>
     <w:tbl>
@@ -2269,16 +2164,7 @@
           <w:rFonts w:ascii="맑은 고딕" w:hAnsi="맑은 고딕" w:eastAsia="맑은 고딕"/>
           <w:sz w:val="21"/>
         </w:rPr>
-        <w:t>**`UNKNOWN`이 29개**다. 이 뷰는 목적지 31개(19c 기준)를 전부 보여 주며 쓰지 않는 목적지는 설정이 비어 `UNKNOWN`이다.</w:t>
-      </w:r>
-    </w:p>
-    <w:p>
-      <w:r>
-        <w:rPr>
-          <w:rFonts w:ascii="맑은 고딕" w:hAnsi="맑은 고딕" w:eastAsia="맑은 고딕"/>
-          <w:sz w:val="21"/>
-        </w:rPr>
-        <w:t>10장에서 Far Sync를 설정한 직후에도 `UNKNOWN`이었다. **막 바꾼 직후와 아예 쓰지 않는 목적지가 같은 값**이므로, `UNKNOWN`을 보면 `DESTINATION`이 비어 있는지 먼저 확인한다.</w:t>
+        <w:t>**`UNKNOWN`이 29개**다. 이 뷰는 목적지 31개(19c 기준)를 전부 보여 주며 쓰지 않는 목적지는 설정이 비어 `UNKNOWN`이다. 10장에서 Far Sync를 설정한 직후에도 `UNKNOWN`이었다. **막 바꾼 직후와 아예 쓰지 않는 목적지가 같은 값**이므로, `UNKNOWN`을 보면 `DESTINATION`이 비어 있는지 먼저 확인한다.</w:t>
       </w:r>
     </w:p>
     <w:tbl>
@@ -2366,7 +2252,7 @@
                 <w:rFonts w:ascii="맑은 고딕" w:hAnsi="맑은 고딕" w:eastAsia="맑은 고딕"/>
                 <w:sz w:val="19"/>
               </w:rPr>
-              <w:t>`WRONG VALID_TYPE`</w:t>
+              <w:t>`WRONG VALID_TYPE`·`WRONG VALID_ROLE`</w:t>
             </w:r>
           </w:p>
         </w:tc>
@@ -2380,37 +2266,7 @@
                 <w:rFonts w:ascii="맑은 고딕" w:hAnsi="맑은 고딕" w:eastAsia="맑은 고딕"/>
                 <w:sz w:val="19"/>
               </w:rPr>
-              <w:t>로그 종류가 맞지 않는다 (10장에서 봤다)</w:t>
-            </w:r>
-          </w:p>
-        </w:tc>
-      </w:tr>
-      <w:tr>
-        <w:tc>
-          <w:tcPr>
-            <w:tcW w:type="dxa" w:w="4320"/>
-          </w:tcPr>
-          <w:p>
-            <w:r>
-              <w:rPr>
-                <w:rFonts w:ascii="맑은 고딕" w:hAnsi="맑은 고딕" w:eastAsia="맑은 고딕"/>
-                <w:sz w:val="19"/>
-              </w:rPr>
-              <w:t>`WRONG VALID_ROLE`</w:t>
-            </w:r>
-          </w:p>
-        </w:tc>
-        <w:tc>
-          <w:tcPr>
-            <w:tcW w:type="dxa" w:w="4320"/>
-          </w:tcPr>
-          <w:p>
-            <w:r>
-              <w:rPr>
-                <w:rFonts w:ascii="맑은 고딕" w:hAnsi="맑은 고딕" w:eastAsia="맑은 고딕"/>
-                <w:sz w:val="19"/>
-              </w:rPr>
-              <w:t>지금 역할에서는 쓰이지 않는다</w:t>
+              <w:t>로그 종류 또는 지금 역할에 맞지 않는다</w:t>
             </w:r>
           </w:p>
         </w:tc>
@@ -2483,16 +2339,7 @@
           <w:rFonts w:ascii="맑은 고딕" w:hAnsi="맑은 고딕" w:eastAsia="맑은 고딕"/>
           <w:sz w:val="21"/>
         </w:rPr>
-        <w:t>boston에서 같은 조회를 하면 1번은 `VALID`·`YES`, 2번은 `DESTINATION`이 비어 있고 `INACTIVE`·`UNKNOWN`이다. 13장에서 Broker가 구성을 만들 때 **Standby 쪽 2번은 비워 두었다.** 역할이 바뀌면 그때 채운다.</w:t>
-      </w:r>
-    </w:p>
-    <w:p>
-      <w:r>
-        <w:rPr>
-          <w:rFonts w:ascii="맑은 고딕" w:hAnsi="맑은 고딕" w:eastAsia="맑은 고딕"/>
-          <w:sz w:val="21"/>
-        </w:rPr>
-        <w:t>이 뷰는 열이 많아 이름을 잘못 쓰기 쉽다.</w:t>
+        <w:t>boston에서 같은 조회를 하면 2번은 `DESTINATION`이 비어 있고 `INACTIVE`·`UNKNOWN`이다. 13장에서 Broker가 **Standby 쪽 2번을 비워 두었고** 역할이 바뀌면 그때 채운다. 열이 많아 이름을 잘못 쓰기도 쉽다.</w:t>
       </w:r>
     </w:p>
     <w:tbl>
@@ -2650,7 +2497,7 @@
                 <w:rFonts w:ascii="맑은 고딕" w:hAnsi="맑은 고딕" w:eastAsia="맑은 고딕"/>
                 <w:sz w:val="20"/>
               </w:rPr>
-              <w:t>열 목록은 `DESC v$archive_dest`로 확인한다. 이 뷰는 열이 40개가 넘으므로 필요한 것만 골라 조회하는 습관이 필요하다. `SELECT *`로 조회하면 화면이 무너진다.</w:t>
+              <w:t>열 목록은 `DESC v$archive_dest`로 확인한다. 40개가 넘으므로 필요한 것만 골라 조회한다.</w:t>
             </w:r>
           </w:p>
         </w:tc>
@@ -2755,32 +2602,6 @@
                 <w:color w:val="F2F2F2"/>
                 <w:sz w:val="19"/>
               </w:rPr>
-              <w:t>ARCH      CLOSING      ARCH                  1         68          1</w:t>
-            </w:r>
-          </w:p>
-          <w:p>
-            <w:pPr>
-              <w:spacing w:after="0" w:before="0"/>
-            </w:pPr>
-            <w:r>
-              <w:rPr>
-                <w:rFonts w:ascii="Consolas" w:hAnsi="Consolas" w:eastAsia="Consolas"/>
-                <w:color w:val="F2F2F2"/>
-                <w:sz w:val="19"/>
-              </w:rPr>
-              <w:t>ARCH      CLOSING      ARCH                  1         71          1</w:t>
-            </w:r>
-          </w:p>
-          <w:p>
-            <w:pPr>
-              <w:spacing w:after="0" w:before="0"/>
-            </w:pPr>
-            <w:r>
-              <w:rPr>
-                <w:rFonts w:ascii="Consolas" w:hAnsi="Consolas" w:eastAsia="Consolas"/>
-                <w:color w:val="F2F2F2"/>
-                <w:sz w:val="19"/>
-              </w:rPr>
               <w:t>ARCH      CLOSING      ARCH                  1         72          1</w:t>
             </w:r>
           </w:p>
@@ -3081,16 +2902,7 @@
           <w:rFonts w:ascii="맑은 고딕" w:hAnsi="맑은 고딕" w:eastAsia="맑은 고딕"/>
           <w:sz w:val="21"/>
         </w:rPr>
-        <w:t>**`RFS(LGWR)`와 `MRP0`의 `SEQUENCE#`·`BLOCK#`이 같다.** 둘 다 74번 시퀀스의 17,964번 블록이며, 받는 즉시 적용한다는 뜻이다. 이것이 **실시간 적용의 모습**이다.</w:t>
-      </w:r>
-    </w:p>
-    <w:p>
-      <w:r>
-        <w:rPr>
-          <w:rFonts w:ascii="맑은 고딕" w:hAnsi="맑은 고딕" w:eastAsia="맑은 고딕"/>
-          <w:sz w:val="21"/>
-        </w:rPr>
-        <w:t>두 값이 벌어지면 적용이 밀린 것이다. 지연을 **블록 단위로** 볼 수 있다. `ARCH`가 `CLOSING`으로 여럿인 것은 정상이다.</w:t>
+        <w:t>**`RFS(LGWR)`와 `MRP0`의 `SEQUENCE#`·`BLOCK#`이 같다.** 둘 다 74번 시퀀스의 17,964번 블록이며 받는 즉시 적용한다는 뜻으로, 이것이 **실시간 적용의 모습**이다. 두 값이 벌어지면 밀린 것이며 지연을 **블록 단위로** 볼 수 있다.</w:t>
       </w:r>
     </w:p>
     <w:tbl>
@@ -3127,7 +2939,7 @@
                 <w:rFonts w:ascii="맑은 고딕" w:hAnsi="맑은 고딕" w:eastAsia="맑은 고딕"/>
                 <w:sz w:val="20"/>
               </w:rPr>
-              <w:t>`APPLYING_LOG` — 적용 중. 정상이다.</w:t>
+              <w:t>`APPLYING_LOG`는 적용 중이며 정상, `WAIT_FOR_LOG`는 다음 리두를 기다리는 것, `WAIT_FOR_GAP`은 갭이 채워지기를 기다리는 것이다.</w:t>
             </w:r>
           </w:p>
           <w:p>
@@ -3139,31 +2951,7 @@
                 <w:rFonts w:ascii="맑은 고딕" w:hAnsi="맑은 고딕" w:eastAsia="맑은 고딕"/>
                 <w:sz w:val="20"/>
               </w:rPr>
-              <w:t>`WAIT_FOR_LOG` — 다음 리두를 기다린다. **리두가 오지 않으면 여기서 멈춰 있다.**</w:t>
-            </w:r>
-          </w:p>
-          <w:p>
-            <w:pPr>
-              <w:spacing w:after="20"/>
-            </w:pPr>
-            <w:r>
-              <w:rPr>
-                <w:rFonts w:ascii="맑은 고딕" w:hAnsi="맑은 고딕" w:eastAsia="맑은 고딕"/>
-                <w:sz w:val="20"/>
-              </w:rPr>
-              <w:t>`WAIT_FOR_GAP` — 갭이 있어 채워지기를 기다린다.</w:t>
-            </w:r>
-          </w:p>
-          <w:p>
-            <w:pPr>
-              <w:spacing w:after="20"/>
-            </w:pPr>
-            <w:r>
-              <w:rPr>
-                <w:rFonts w:ascii="맑은 고딕" w:hAnsi="맑은 고딕" w:eastAsia="맑은 고딕"/>
-                <w:sz w:val="20"/>
-              </w:rPr>
-              <w:t>한가한 시스템에서는 `WAIT_FOR_LOG`도 정상일 수 있다. **`SEQUENCE#`가 Primary의 현재 시퀀스와 같은지**를 함께 봐야 구별된다. MRP0 행 자체가 없으면 적용이 멈춘 것이다.</w:t>
+              <w:t>한가한 시스템에서는 `WAIT_FOR_LOG`도 정상일 수 있다. **`SEQUENCE#`가 Primary의 현재 시퀀스와 같은지**를 함께 봐야 구별되며, MRP0 행 자체가 없으면 적용이 멈춘 것이다.</w:t>
             </w:r>
           </w:p>
         </w:tc>
@@ -3307,32 +3095,6 @@
                 <w:color w:val="F2F2F2"/>
                 <w:sz w:val="19"/>
               </w:rPr>
-              <w:t xml:space="preserve">         1         72 NO        19:57:53</w:t>
-            </w:r>
-          </w:p>
-          <w:p>
-            <w:pPr>
-              <w:spacing w:after="0" w:before="0"/>
-            </w:pPr>
-            <w:r>
-              <w:rPr>
-                <w:rFonts w:ascii="Consolas" w:hAnsi="Consolas" w:eastAsia="Consolas"/>
-                <w:color w:val="F2F2F2"/>
-                <w:sz w:val="19"/>
-              </w:rPr>
-              <w:t xml:space="preserve">         2         72 YES       19:57:53</w:t>
-            </w:r>
-          </w:p>
-          <w:p>
-            <w:pPr>
-              <w:spacing w:after="0" w:before="0"/>
-            </w:pPr>
-            <w:r>
-              <w:rPr>
-                <w:rFonts w:ascii="Consolas" w:hAnsi="Consolas" w:eastAsia="Consolas"/>
-                <w:color w:val="F2F2F2"/>
-                <w:sz w:val="19"/>
-              </w:rPr>
               <w:t xml:space="preserve">         1         70 NO        19:55:38</w:t>
             </w:r>
           </w:p>
@@ -3359,25 +3121,7 @@
           <w:rFonts w:ascii="맑은 고딕" w:hAnsi="맑은 고딕" w:eastAsia="맑은 고딕"/>
           <w:sz w:val="21"/>
         </w:rPr>
-        <w:t>**같은 시퀀스가 두 줄씩 나오고 `APPLIED`가 서로 다르다.** 오해하면 "절반이 적용되지 않았다"고 잘못 읽는다.</w:t>
-      </w:r>
-    </w:p>
-    <w:p>
-      <w:r>
-        <w:rPr>
-          <w:rFonts w:ascii="맑은 고딕" w:hAnsi="맑은 고딕" w:eastAsia="맑은 고딕"/>
-          <w:sz w:val="21"/>
-        </w:rPr>
-        <w:t>`dest_id=1`은 **Primary 자신의 로컬 아카이브**이므로 영원히 `NO`다. `dest_id=2`가 Standby로 보낸 것이며 이 행이 실제 적용 여부다.</w:t>
-      </w:r>
-    </w:p>
-    <w:p>
-      <w:r>
-        <w:rPr>
-          <w:rFonts w:ascii="맑은 고딕" w:hAnsi="맑은 고딕" w:eastAsia="맑은 고딕"/>
-          <w:sz w:val="21"/>
-        </w:rPr>
-        <w:t>**Primary에서 적용 여부를 볼 때는 `WHERE dest_id=2`가 필수**다. 빼면 항상 절반이 `NO`로 나온다.</w:t>
+        <w:t>**같은 시퀀스가 두 줄씩 나오고 `APPLIED`가 서로 다르다.** `dest_id=1`은 **Primary 자신의 로컬 아카이브**이므로 영원히 `NO`이고 `dest_id=2`가 실제 적용 여부다. **`WHERE dest_id=2`가 필수**이며 빼면 항상 절반이 `NO`로 나온다.</w:t>
       </w:r>
     </w:p>
     <w:p>
@@ -3824,16 +3568,7 @@
           <w:rFonts w:ascii="맑은 고딕" w:hAnsi="맑은 고딕" w:eastAsia="맑은 고딕"/>
           <w:sz w:val="21"/>
         </w:rPr>
-        <w:t>`STATUS`는 `VALID`에서 **`ERROR`**로, `VALID_NOW`는 `YES`에서 **`INACTIVE`**로, 비어 있던 `ERROR`에는 **`ORA-12541`**이 들어왔다.</w:t>
-      </w:r>
-    </w:p>
-    <w:p>
-      <w:r>
-        <w:rPr>
-          <w:rFonts w:ascii="맑은 고딕" w:hAnsi="맑은 고딕" w:eastAsia="맑은 고딕"/>
-          <w:sz w:val="21"/>
-        </w:rPr>
-        <w:t>**`ERROR` 열에 실제 원인이 그대로 들어 있다.** 이것이 이 뷰의 값어치다. `VALID_NOW`가 `INACTIVE`인 것은 **설정은 유효한데 지금 동작하지 않는다**는 뜻이다.</w:t>
+        <w:t>`STATUS`는 `VALID`에서 **`ERROR`**로, `VALID_NOW`는 `YES`에서 **`INACTIVE`**로 바뀌고 **`ORA-12541`**이 들어왔다. **`ERROR` 열에 실제 원인이 그대로 있다.** `VALID_NOW`의 `INACTIVE`는 **설정은 유효한데 지금 동작하지 않는다**는 뜻이다.</w:t>
       </w:r>
     </w:p>
     <w:tbl>
@@ -3861,7 +3596,7 @@
                 <w:color w:val="F2F2F2"/>
                 <w:sz w:val="19"/>
               </w:rPr>
-              <w:t>SYS@chicago&gt; select name, value from v$parameter</w:t>
+              <w:t>SYS@chicago&gt; select value from v$parameter where name='log_archive_dest_state_2';</w:t>
             </w:r>
           </w:p>
           <w:p>
@@ -3874,7 +3609,7 @@
                 <w:color w:val="F2F2F2"/>
                 <w:sz w:val="19"/>
               </w:rPr>
-              <w:t xml:space="preserve">  2            where name='log_archive_dest_state_2';</w:t>
+              <w:t xml:space="preserve"> </w:t>
             </w:r>
           </w:p>
           <w:p>
@@ -3887,7 +3622,7 @@
                 <w:color w:val="F2F2F2"/>
                 <w:sz w:val="19"/>
               </w:rPr>
-              <w:t xml:space="preserve"> </w:t>
+              <w:t>VALUE</w:t>
             </w:r>
           </w:p>
           <w:p>
@@ -3900,7 +3635,7 @@
                 <w:color w:val="F2F2F2"/>
                 <w:sz w:val="19"/>
               </w:rPr>
-              <w:t>NAME                     VALUE</w:t>
+              <w:t>----------</w:t>
             </w:r>
           </w:p>
           <w:p>
@@ -3913,20 +3648,7 @@
                 <w:color w:val="F2F2F2"/>
                 <w:sz w:val="19"/>
               </w:rPr>
-              <w:t>------------------------ ----------</w:t>
-            </w:r>
-          </w:p>
-          <w:p>
-            <w:pPr>
-              <w:spacing w:after="0" w:before="0"/>
-            </w:pPr>
-            <w:r>
-              <w:rPr>
-                <w:rFonts w:ascii="Consolas" w:hAnsi="Consolas" w:eastAsia="Consolas"/>
-                <w:color w:val="F2F2F2"/>
-                <w:sz w:val="19"/>
-              </w:rPr>
-              <w:t>log_archive_dest_state_2 ENABLE</w:t>
+              <w:t>ENABLE</w:t>
             </w:r>
           </w:p>
         </w:tc>
@@ -4187,7 +3909,7 @@
           <w:rFonts w:ascii="맑은 고딕" w:hAnsi="맑은 고딕" w:eastAsia="맑은 고딕"/>
           <w:sz w:val="21"/>
         </w:rPr>
-        <w:t>두 열의 조합만으로 "장애인가 설정인가"가 갈린다.</w:t>
+        <w:t>두 열의 조합으로 "장애인가 설정인가"가 갈린다.</w:t>
       </w:r>
     </w:p>
     <w:p>
@@ -4275,7 +3997,7 @@
                 <w:color w:val="F2F2F2"/>
                 <w:sz w:val="19"/>
               </w:rPr>
-              <w:t>SEVERITY      ERROR_CODE TS       MESSAGE</w:t>
+              <w:t>SEVERITY   ERROR_CODE TS       MESSAGE</w:t>
             </w:r>
           </w:p>
           <w:p>
@@ -4288,7 +4010,7 @@
                 <w:color w:val="F2F2F2"/>
                 <w:sz w:val="19"/>
               </w:rPr>
-              <w:t>------------- ---------- -------- ------------------------------------------------</w:t>
+              <w:t>---------- ---------- -------- --------------------------------------------------</w:t>
             </w:r>
           </w:p>
           <w:p>
@@ -4301,7 +4023,7 @@
                 <w:color w:val="F2F2F2"/>
                 <w:sz w:val="19"/>
               </w:rPr>
-              <w:t>Error              12541 09:17:13 Error 12541 received logging on to the standby</w:t>
+              <w:t>Error           12541 09:17:13 Error 12541 received logging on to the standby</w:t>
             </w:r>
           </w:p>
           <w:p>
@@ -4314,7 +4036,7 @@
                 <w:color w:val="F2F2F2"/>
                 <w:sz w:val="19"/>
               </w:rPr>
-              <w:t>Warning            12541 09:17:13 Check whether the listener is up and running.</w:t>
+              <w:t>Warning         12541 09:17:13 Check whether the listener is up and running.</w:t>
             </w:r>
           </w:p>
           <w:p>
@@ -4327,7 +4049,7 @@
                 <w:color w:val="F2F2F2"/>
                 <w:sz w:val="19"/>
               </w:rPr>
-              <w:t>Error              12541 09:17:13 FAL: Error 12541 creating remote archived redo log file 'boston'</w:t>
+              <w:t>Error           12541 09:17:13 FAL: Error 12541 creating remote archived redo log</w:t>
             </w:r>
           </w:p>
         </w:tc>
@@ -4340,7 +4062,7 @@
           <w:rFonts w:ascii="맑은 고딕" w:hAnsi="맑은 고딕" w:eastAsia="맑은 고딕"/>
           <w:sz w:val="21"/>
         </w:rPr>
-        <w:t>14장에서 정한 `ERROR_CODE &lt;&gt; 0` 조건이 이번에는 실제로 무언가를 잡아냈다.</w:t>
+        <w:t>14장에서 정한 `ERROR_CODE &lt;&gt; 0` 조건이 실제로 무언가를 잡아냈다.</w:t>
       </w:r>
     </w:p>
     <w:p>
@@ -4349,7 +4071,7 @@
           <w:rFonts w:ascii="맑은 고딕" w:hAnsi="맑은 고딕" w:eastAsia="맑은 고딕"/>
           <w:sz w:val="21"/>
         </w:rPr>
-        <w:t>**두 번째 행이 인상적이다.** `Check whether the listener is up and running.` — 조치까지 알려 준다. `SEVERITY`가 `Warning`인데 `ERROR_CODE`는 12541이다. 14장과 반대로 **`Warning`인데 봐야 하는 행**이다. 판정 기준은 `SEVERITY`가 아니라 `ERROR_CODE`다.</w:t>
+        <w:t>**두 번째 행이 인상적이다.** `Check whether the listener is up and running.` — 조치까지 알려 준다. `SEVERITY`는 `Warning`인데 `ERROR_CODE`는 12541이다. **판정 기준은 `SEVERITY`가 아니라 `ERROR_CODE`다.**</w:t>
       </w:r>
     </w:p>
     <w:tbl>
@@ -4416,7 +4138,7 @@
                 <w:color w:val="F2F2F2"/>
                 <w:sz w:val="19"/>
               </w:rPr>
-              <w:t xml:space="preserve"> (DESCRIPTION=(ADDRESS_LIST=(ADDRESS=(PROTOCOL=TCP)(HOST=boston-srv.localdomain)</w:t>
+              <w:t xml:space="preserve"> (DESCRIPTION=(ADDRESS=(PROTOCOL=TCP)(HOST=boston-srv.localdomain)(PORT=1521))</w:t>
             </w:r>
           </w:p>
           <w:p>
@@ -4429,7 +4151,7 @@
                 <w:color w:val="F2F2F2"/>
                 <w:sz w:val="19"/>
               </w:rPr>
-              <w:t xml:space="preserve">  (PORT=1521)))(CONNECT_DATA=(SERVICE_NAME=boston)...))</w:t>
+              <w:t xml:space="preserve">  (CONNECT_DATA=(SERVICE_NAME=boston)...))</w:t>
             </w:r>
           </w:p>
           <w:p>
@@ -4455,7 +4177,7 @@
                 <w:color w:val="F2F2F2"/>
                 <w:sz w:val="19"/>
               </w:rPr>
-              <w:t>Errors in file .../trace/chicago_arc1_2482.trc:</w:t>
+              <w:t>Errors in file .../trace/chicago_arc1_2482.trc:  ORA-12541: TNS:no listener</w:t>
             </w:r>
           </w:p>
           <w:p>
@@ -4468,33 +4190,7 @@
                 <w:color w:val="F2F2F2"/>
                 <w:sz w:val="19"/>
               </w:rPr>
-              <w:t>ORA-12541: TNS:no listener</w:t>
-            </w:r>
-          </w:p>
-          <w:p>
-            <w:pPr>
-              <w:spacing w:after="0" w:before="0"/>
-            </w:pPr>
-            <w:r>
-              <w:rPr>
-                <w:rFonts w:ascii="Consolas" w:hAnsi="Consolas" w:eastAsia="Consolas"/>
-                <w:color w:val="F2F2F2"/>
-                <w:sz w:val="19"/>
-              </w:rPr>
-              <w:t>ARC1 (PID:2482): FAL: Error 12541 creating remote archived redo log file 'boston'</w:t>
-            </w:r>
-          </w:p>
-          <w:p>
-            <w:pPr>
-              <w:spacing w:after="0" w:before="0"/>
-            </w:pPr>
-            <w:r>
-              <w:rPr>
-                <w:rFonts w:ascii="Consolas" w:hAnsi="Consolas" w:eastAsia="Consolas"/>
-                <w:color w:val="F2F2F2"/>
-                <w:sz w:val="19"/>
-              </w:rPr>
-              <w:t>ARC1 (PID:2482): FAL archive failed with error 12541 (see trace for details)</w:t>
+              <w:t>ARC1 (PID:2482): FAL: Error 12541 creating remote archived redo log 'boston'</w:t>
             </w:r>
           </w:p>
           <w:p>
@@ -4557,7 +4253,7 @@
           <w:rFonts w:ascii="맑은 고딕" w:hAnsi="맑은 고딕" w:eastAsia="맑은 고딕"/>
           <w:sz w:val="21"/>
         </w:rPr>
-        <w:t>**어느 프로세스인가** — `ARC1 (PID:2482)`. 트레이스 파일 `chicago_arc1_2482.trc`와 연결된다.</w:t>
+        <w:t>**어느 프로세스인가** — `ARC1 (PID:2482)`. 트레이스 파일과 연결된다.</w:t>
       </w:r>
     </w:p>
     <w:p>
@@ -4569,19 +4265,7 @@
           <w:rFonts w:ascii="맑은 고딕" w:hAnsi="맑은 고딕" w:eastAsia="맑은 고딕"/>
           <w:sz w:val="21"/>
         </w:rPr>
-        <w:t>**`ORA-16055: FAL request rejected`** — 8장에서 갭을 다룰 때 본 메커니즘이다.</w:t>
-      </w:r>
-    </w:p>
-    <w:p>
-      <w:pPr>
-        <w:pStyle w:val="ListBullet"/>
-      </w:pPr>
-      <w:r>
-        <w:rPr>
-          <w:rFonts w:ascii="맑은 고딕" w:hAnsi="맑은 고딕" w:eastAsia="맑은 고딕"/>
-          <w:sz w:val="21"/>
-        </w:rPr>
-        <w:t>**`archiver continuing`** — 아카이버가 멈추지 않았다.</w:t>
+        <w:t>**`ORA-16055`**(FAL request rejected)와 **`archiver continuing`** — 아카이버가 멈추지 않았다.</w:t>
       </w:r>
     </w:p>
     <w:p>
@@ -4743,59 +4427,7 @@
                 <w:color w:val="F2F2F2"/>
                 <w:sz w:val="19"/>
               </w:rPr>
-              <w:t xml:space="preserve"> </w:t>
-            </w:r>
-          </w:p>
-          <w:p>
-            <w:pPr>
-              <w:spacing w:after="0" w:before="0"/>
-            </w:pPr>
-            <w:r>
-              <w:rPr>
-                <w:rFonts w:ascii="Consolas" w:hAnsi="Consolas" w:eastAsia="Consolas"/>
-                <w:color w:val="F2F2F2"/>
-                <w:sz w:val="19"/>
-              </w:rPr>
-              <w:t>NAME             VALUE</w:t>
-            </w:r>
-          </w:p>
-          <w:p>
-            <w:pPr>
-              <w:spacing w:after="0" w:before="0"/>
-            </w:pPr>
-            <w:r>
-              <w:rPr>
-                <w:rFonts w:ascii="Consolas" w:hAnsi="Consolas" w:eastAsia="Consolas"/>
-                <w:color w:val="F2F2F2"/>
-                <w:sz w:val="19"/>
-              </w:rPr>
-              <w:t>---------------- --------------------</w:t>
-            </w:r>
-          </w:p>
-          <w:p>
-            <w:pPr>
-              <w:spacing w:after="0" w:before="0"/>
-            </w:pPr>
-            <w:r>
-              <w:rPr>
-                <w:rFonts w:ascii="Consolas" w:hAnsi="Consolas" w:eastAsia="Consolas"/>
-                <w:color w:val="F2F2F2"/>
-                <w:sz w:val="19"/>
-              </w:rPr>
-              <w:t>transport lag    +00 00:00:00</w:t>
-            </w:r>
-          </w:p>
-          <w:p>
-            <w:pPr>
-              <w:spacing w:after="0" w:before="0"/>
-            </w:pPr>
-            <w:r>
-              <w:rPr>
-                <w:rFonts w:ascii="Consolas" w:hAnsi="Consolas" w:eastAsia="Consolas"/>
-                <w:color w:val="F2F2F2"/>
-                <w:sz w:val="19"/>
-              </w:rPr>
-              <w:t>apply lag        +00 00:00:00</w:t>
+              <w:t xml:space="preserve">   --&gt; transport lag +00 00:00:00 / apply lag +00 00:00:00</w:t>
             </w:r>
           </w:p>
         </w:tc>
@@ -5221,7 +4853,7 @@
                 <w:color w:val="F2F2F2"/>
                 <w:sz w:val="19"/>
               </w:rPr>
-              <w:t xml:space="preserve">  Protection Mode: MaxPerformance</w:t>
+              <w:t xml:space="preserve">  chicago - Primary database</w:t>
             </w:r>
           </w:p>
           <w:p>
@@ -5234,7 +4866,7 @@
                 <w:color w:val="F2F2F2"/>
                 <w:sz w:val="19"/>
               </w:rPr>
-              <w:t xml:space="preserve">  Members:</w:t>
+              <w:t xml:space="preserve">    boston  - Physical standby database</w:t>
             </w:r>
           </w:p>
           <w:p>
@@ -5247,7 +4879,7 @@
                 <w:color w:val="F2F2F2"/>
                 <w:sz w:val="19"/>
               </w:rPr>
-              <w:t xml:space="preserve">  chicago - Primary database</w:t>
+              <w:t xml:space="preserve">      Warning: ORA-16857: member disconnected from redo source for</w:t>
             </w:r>
           </w:p>
           <w:p>
@@ -5260,59 +4892,7 @@
                 <w:color w:val="F2F2F2"/>
                 <w:sz w:val="19"/>
               </w:rPr>
-              <w:t xml:space="preserve">    boston  - Physical standby database</w:t>
-            </w:r>
-          </w:p>
-          <w:p>
-            <w:pPr>
-              <w:spacing w:after="0" w:before="0"/>
-            </w:pPr>
-            <w:r>
-              <w:rPr>
-                <w:rFonts w:ascii="Consolas" w:hAnsi="Consolas" w:eastAsia="Consolas"/>
-                <w:color w:val="F2F2F2"/>
-                <w:sz w:val="19"/>
-              </w:rPr>
-              <w:t xml:space="preserve">      Warning: ORA-16857: member disconnected from redo source for</w:t>
-            </w:r>
-          </w:p>
-          <w:p>
-            <w:pPr>
-              <w:spacing w:after="0" w:before="0"/>
-            </w:pPr>
-            <w:r>
-              <w:rPr>
-                <w:rFonts w:ascii="Consolas" w:hAnsi="Consolas" w:eastAsia="Consolas"/>
-                <w:color w:val="F2F2F2"/>
-                <w:sz w:val="19"/>
-              </w:rPr>
               <w:t xml:space="preserve">               longer than specified threshold</w:t>
-            </w:r>
-          </w:p>
-          <w:p>
-            <w:pPr>
-              <w:spacing w:after="0" w:before="0"/>
-            </w:pPr>
-            <w:r>
-              <w:rPr>
-                <w:rFonts w:ascii="Consolas" w:hAnsi="Consolas" w:eastAsia="Consolas"/>
-                <w:color w:val="F2F2F2"/>
-                <w:sz w:val="19"/>
-              </w:rPr>
-              <w:t xml:space="preserve"> </w:t>
-            </w:r>
-          </w:p>
-          <w:p>
-            <w:pPr>
-              <w:spacing w:after="0" w:before="0"/>
-            </w:pPr>
-            <w:r>
-              <w:rPr>
-                <w:rFonts w:ascii="Consolas" w:hAnsi="Consolas" w:eastAsia="Consolas"/>
-                <w:color w:val="F2F2F2"/>
-                <w:sz w:val="19"/>
-              </w:rPr>
-              <w:t>Fast-Start Failover:  Disabled</w:t>
             </w:r>
           </w:p>
           <w:p>
@@ -5364,16 +4944,7 @@
           <w:rFonts w:ascii="맑은 고딕" w:hAnsi="맑은 고딕" w:eastAsia="맑은 고딕"/>
           <w:sz w:val="21"/>
         </w:rPr>
-        <w:t>**이번에는 경보가 떴다.** 14장에서 속성으로 껐을 때는 `SUCCESS`였는데 지금은 `WARNING`이다. 이번 중단은 **의도한 상태가 아니고**, `TransportDisconnectedThreshold`라는 **임계값이 있기** 때문이다. 14장에서 정리한 규칙 그대로다.</w:t>
-      </w:r>
-    </w:p>
-    <w:p>
-      <w:r>
-        <w:rPr>
-          <w:rFonts w:ascii="맑은 고딕" w:hAnsi="맑은 고딕" w:eastAsia="맑은 고딕"/>
-          <w:sz w:val="21"/>
-        </w:rPr>
-        <w:t>`ORA-16857`은 그 셋 중 세 번째다. 기본값 30초가 지나 경보가 떴다.</w:t>
+        <w:t>**이번에는 경보가 떴다.** 14장에서 속성으로 껐을 때는 `SUCCESS`였는데 지금은 `WARNING`이다. **의도한 상태가 아니고** `TransportDisconnectedThreshold`라는 **임계값이 있기** 때문이며, 기본값 30초가 지나 `ORA-16857`이 떴다.</w:t>
       </w:r>
     </w:p>
     <w:tbl>
@@ -5427,7 +4998,7 @@
                 <w:color w:val="F2F2F2"/>
                 <w:sz w:val="19"/>
               </w:rPr>
-              <w:t xml:space="preserve">  Transport Lag:      0 seconds (computed 56 seconds ago)</w:t>
+              <w:t xml:space="preserve">  Transport Lag / Apply Lag:  0 seconds (computed 56 seconds ago)</w:t>
             </w:r>
           </w:p>
           <w:p>
@@ -5440,7 +5011,7 @@
                 <w:color w:val="F2F2F2"/>
                 <w:sz w:val="19"/>
               </w:rPr>
-              <w:t xml:space="preserve">  Apply Lag:          0 seconds (computed 56 seconds ago)</w:t>
+              <w:t xml:space="preserve">  Average Apply Rate:         0 Byte/s</w:t>
             </w:r>
           </w:p>
           <w:p>
@@ -5453,7 +5024,7 @@
                 <w:color w:val="F2F2F2"/>
                 <w:sz w:val="19"/>
               </w:rPr>
-              <w:t xml:space="preserve">  Average Apply Rate: 0 Byte/s</w:t>
+              <w:t xml:space="preserve">  Database Warning(s):  ORA-16857: member disconnected from redo source ...</w:t>
             </w:r>
           </w:p>
           <w:p>
@@ -5466,7 +5037,7 @@
                 <w:color w:val="F2F2F2"/>
                 <w:sz w:val="19"/>
               </w:rPr>
-              <w:t xml:space="preserve">  Database Warning(s):</w:t>
+              <w:t xml:space="preserve"> </w:t>
             </w:r>
           </w:p>
           <w:p>
@@ -5479,7 +5050,7 @@
                 <w:color w:val="F2F2F2"/>
                 <w:sz w:val="19"/>
               </w:rPr>
-              <w:t xml:space="preserve">    ORA-16857: member disconnected from redo source ...</w:t>
+              <w:t>DGMGRL&gt; validate database 'boston'</w:t>
             </w:r>
           </w:p>
           <w:p>
@@ -5505,46 +5076,7 @@
                 <w:color w:val="F2F2F2"/>
                 <w:sz w:val="19"/>
               </w:rPr>
-              <w:t>DGMGRL&gt; validate database 'boston'</w:t>
-            </w:r>
-          </w:p>
-          <w:p>
-            <w:pPr>
-              <w:spacing w:after="0" w:before="0"/>
-            </w:pPr>
-            <w:r>
-              <w:rPr>
-                <w:rFonts w:ascii="Consolas" w:hAnsi="Consolas" w:eastAsia="Consolas"/>
-                <w:color w:val="F2F2F2"/>
-                <w:sz w:val="19"/>
-              </w:rPr>
-              <w:t xml:space="preserve"> </w:t>
-            </w:r>
-          </w:p>
-          <w:p>
-            <w:pPr>
-              <w:spacing w:after="0" w:before="0"/>
-            </w:pPr>
-            <w:r>
-              <w:rPr>
-                <w:rFonts w:ascii="Consolas" w:hAnsi="Consolas" w:eastAsia="Consolas"/>
-                <w:color w:val="F2F2F2"/>
-                <w:sz w:val="19"/>
-              </w:rPr>
               <w:t xml:space="preserve">  Ready for Switchover:  No</w:t>
-            </w:r>
-          </w:p>
-          <w:p>
-            <w:pPr>
-              <w:spacing w:after="0" w:before="0"/>
-            </w:pPr>
-            <w:r>
-              <w:rPr>
-                <w:rFonts w:ascii="Consolas" w:hAnsi="Consolas" w:eastAsia="Consolas"/>
-                <w:color w:val="F2F2F2"/>
-                <w:sz w:val="19"/>
-              </w:rPr>
-              <w:t xml:space="preserve">  Ready for Failover:    Yes (Primary Running)</w:t>
             </w:r>
           </w:p>
         </w:tc>
@@ -5609,7 +5141,7 @@
                 <w:b/>
                 <w:sz w:val="19"/>
               </w:rPr>
-              <w:t>이 상황에서의 답</w:t>
+              <w:t>답</w:t>
             </w:r>
           </w:p>
         </w:tc>
@@ -5787,7 +5319,7 @@
                 <w:rFonts w:ascii="맑은 고딕" w:hAnsi="맑은 고딕" w:eastAsia="맑은 고딕"/>
                 <w:sz w:val="19"/>
               </w:rPr>
-              <w:t>접속 문자열·프로세스·트레이스 파일</w:t>
+              <w:t>접속 문자열·프로세스</w:t>
             </w:r>
           </w:p>
         </w:tc>
@@ -6038,16 +5570,7 @@
           <w:rFonts w:ascii="맑은 고딕" w:hAnsi="맑은 고딕" w:eastAsia="맑은 고딕"/>
           <w:sz w:val="21"/>
         </w:rPr>
-        <w:t>이것이 **갭이 만들어지는 과정**이다. 8장의 개념을 시퀀스 번호로 확인한 셈이다.</w:t>
-      </w:r>
-    </w:p>
-    <w:p>
-      <w:r>
-        <w:rPr>
-          <w:rFonts w:ascii="맑은 고딕" w:hAnsi="맑은 고딕" w:eastAsia="맑은 고딕"/>
-          <w:sz w:val="21"/>
-        </w:rPr>
-        <w:t>`V$ARCHIVE_GAP`은 비어 있다. Standby가 못 받은 구간을 인식해야 채워지는데 지금은 연락 자체를 못 받고 있다. **갭 뷰가 비어 있다고 갭이 없는 것이 아니다.**</w:t>
+        <w:t>이것이 **갭이 만들어지는 과정**이다. `V$ARCHIVE_GAP`은 비어 있는데, Standby가 못 받은 구간을 인식해야 채워지지만 지금은 연락 자체를 못 받고 있다. **갭 뷰가 비어 있다고 갭이 없는 것이 아니다.**</w:t>
       </w:r>
     </w:p>
     <w:p>
@@ -6096,7 +5619,7 @@
                 <w:color w:val="F2F2F2"/>
                 <w:sz w:val="19"/>
               </w:rPr>
-              <w:t xml:space="preserve"> </w:t>
+              <w:t xml:space="preserve">   --&gt; Service "boston" / "boston_DGMGRL" has 1 instance(s).</w:t>
             </w:r>
           </w:p>
           <w:p>
@@ -6109,59 +5632,7 @@
                 <w:color w:val="F2F2F2"/>
                 <w:sz w:val="19"/>
               </w:rPr>
-              <w:t>Service "boston" has 1 instance(s).</w:t>
-            </w:r>
-          </w:p>
-          <w:p>
-            <w:pPr>
-              <w:spacing w:after="0" w:before="0"/>
-            </w:pPr>
-            <w:r>
-              <w:rPr>
-                <w:rFonts w:ascii="Consolas" w:hAnsi="Consolas" w:eastAsia="Consolas"/>
-                <w:color w:val="F2F2F2"/>
-                <w:sz w:val="19"/>
-              </w:rPr>
-              <w:t xml:space="preserve">  Instance "boston", status UNKNOWN, has 1 handler(s) for this service...</w:t>
-            </w:r>
-          </w:p>
-          <w:p>
-            <w:pPr>
-              <w:spacing w:after="0" w:before="0"/>
-            </w:pPr>
-            <w:r>
-              <w:rPr>
-                <w:rFonts w:ascii="Consolas" w:hAnsi="Consolas" w:eastAsia="Consolas"/>
-                <w:color w:val="F2F2F2"/>
-                <w:sz w:val="19"/>
-              </w:rPr>
-              <w:t>Service "boston_DGMGRL" has 1 instance(s).</w:t>
-            </w:r>
-          </w:p>
-          <w:p>
-            <w:pPr>
-              <w:spacing w:after="0" w:before="0"/>
-            </w:pPr>
-            <w:r>
-              <w:rPr>
-                <w:rFonts w:ascii="Consolas" w:hAnsi="Consolas" w:eastAsia="Consolas"/>
-                <w:color w:val="F2F2F2"/>
-                <w:sz w:val="19"/>
-              </w:rPr>
-              <w:t xml:space="preserve">  Instance "boston", status UNKNOWN, has 1 handler(s) for this service...</w:t>
-            </w:r>
-          </w:p>
-          <w:p>
-            <w:pPr>
-              <w:spacing w:after="0" w:before="0"/>
-            </w:pPr>
-            <w:r>
-              <w:rPr>
-                <w:rFonts w:ascii="Consolas" w:hAnsi="Consolas" w:eastAsia="Consolas"/>
-                <w:color w:val="F2F2F2"/>
-                <w:sz w:val="19"/>
-              </w:rPr>
-              <w:t>The command completed successfully</w:t>
+              <w:t xml:space="preserve">   --&gt; The command completed successfully</w:t>
             </w:r>
           </w:p>
         </w:tc>
@@ -6300,7 +5771,7 @@
                 <w:rFonts w:ascii="맑은 고딕" w:hAnsi="맑은 고딕" w:eastAsia="맑은 고딕"/>
                 <w:sz w:val="20"/>
               </w:rPr>
-              <w:t>급하면 재촉할 수 있다. Broker 환경이라면 `EDIT DATABASE 'boston' SET PROPERTY 'LogShipping'='OFF';` 후 다시 `'ON'`으로 준다. 목적지 상태가 초기화되면서 즉시 재시도한다.</w:t>
+              <w:t>급하면 재촉할 수 있다. Broker 환경이라면 `EDIT DATABASE 'boston' SET PROPERTY 'LogShipping'='OFF';` 후 다시 `'ON'`으로 주면 목적지 상태가 초기화되며 즉시 재시도한다.</w:t>
             </w:r>
           </w:p>
           <w:p>
@@ -6312,7 +5783,7 @@
                 <w:rFonts w:ascii="맑은 고딕" w:hAnsi="맑은 고딕" w:eastAsia="맑은 고딕"/>
                 <w:sz w:val="20"/>
               </w:rPr>
-              <w:t>Broker가 없다면 `ALTER SYSTEM SET LOG_ARCHIVE_DEST_STATE_2=DEFER;` 후 `ENABLE`이다. **Broker 환경에서 이 SQL을 쓰면 안 된다.** 13장에서 확인한 대로 Broker가 관리하는 파라미터를 SQL로 바꾸는 것이기 때문이다.</w:t>
+              <w:t>Broker가 없다면 `ALTER SYSTEM SET LOG_ARCHIVE_DEST_STATE_2=DEFER;` 후 `ENABLE`이다. **Broker 환경에서 이 SQL을 쓰면 안 된다.** Broker가 관리하는 파라미터이기 때문이다.</w:t>
             </w:r>
           </w:p>
           <w:p>
@@ -6324,7 +5795,7 @@
                 <w:rFonts w:ascii="맑은 고딕" w:hAnsi="맑은 고딕" w:eastAsia="맑은 고딕"/>
                 <w:sz w:val="20"/>
               </w:rPr>
-              <w:t>`ReopenSecs`를 줄이는 방법도 있다. 다만 너무 짧으면 죽은 목적지에 계속 접속을 시도해 자원을 쓴다. 기본 300초는 그 균형점이다.</w:t>
+              <w:t>`ReopenSecs`를 줄일 수도 있으나 너무 짧으면 죽은 목적지에 계속 접속한다. 기본 300초가 균형점이다.</w:t>
             </w:r>
           </w:p>
         </w:tc>
@@ -6378,7 +5849,7 @@
                 <w:color w:val="F2F2F2"/>
                 <w:sz w:val="19"/>
               </w:rPr>
-              <w:t xml:space="preserve"> </w:t>
+              <w:t xml:space="preserve">   --&gt; 92  listener-down</w:t>
             </w:r>
           </w:p>
           <w:p>
@@ -6391,7 +5862,7 @@
                 <w:color w:val="F2F2F2"/>
                 <w:sz w:val="19"/>
               </w:rPr>
-              <w:t xml:space="preserve">        ID TAG</w:t>
+              <w:t>SYS@boston&gt; select name, value from v$dataguard_stats where name like '%lag';</w:t>
             </w:r>
           </w:p>
           <w:p>
@@ -6404,85 +5875,7 @@
                 <w:color w:val="F2F2F2"/>
                 <w:sz w:val="19"/>
               </w:rPr>
-              <w:t>---------- ----------------</w:t>
-            </w:r>
-          </w:p>
-          <w:p>
-            <w:pPr>
-              <w:spacing w:after="0" w:before="0"/>
-            </w:pPr>
-            <w:r>
-              <w:rPr>
-                <w:rFonts w:ascii="Consolas" w:hAnsi="Consolas" w:eastAsia="Consolas"/>
-                <w:color w:val="F2F2F2"/>
-                <w:sz w:val="19"/>
-              </w:rPr>
-              <w:t xml:space="preserve">        92 listener-down</w:t>
-            </w:r>
-          </w:p>
-          <w:p>
-            <w:pPr>
-              <w:spacing w:after="0" w:before="0"/>
-            </w:pPr>
-            <w:r>
-              <w:rPr>
-                <w:rFonts w:ascii="Consolas" w:hAnsi="Consolas" w:eastAsia="Consolas"/>
-                <w:color w:val="F2F2F2"/>
-                <w:sz w:val="19"/>
-              </w:rPr>
-              <w:t xml:space="preserve"> </w:t>
-            </w:r>
-          </w:p>
-          <w:p>
-            <w:pPr>
-              <w:spacing w:after="0" w:before="0"/>
-            </w:pPr>
-            <w:r>
-              <w:rPr>
-                <w:rFonts w:ascii="Consolas" w:hAnsi="Consolas" w:eastAsia="Consolas"/>
-                <w:color w:val="F2F2F2"/>
-                <w:sz w:val="19"/>
-              </w:rPr>
-              <w:t>SYS@boston&gt; select name, value from v$dataguard_stats where name like '%lag';</w:t>
-            </w:r>
-          </w:p>
-          <w:p>
-            <w:pPr>
-              <w:spacing w:after="0" w:before="0"/>
-            </w:pPr>
-            <w:r>
-              <w:rPr>
-                <w:rFonts w:ascii="Consolas" w:hAnsi="Consolas" w:eastAsia="Consolas"/>
-                <w:color w:val="F2F2F2"/>
-                <w:sz w:val="19"/>
-              </w:rPr>
-              <w:t xml:space="preserve"> </w:t>
-            </w:r>
-          </w:p>
-          <w:p>
-            <w:pPr>
-              <w:spacing w:after="0" w:before="0"/>
-            </w:pPr>
-            <w:r>
-              <w:rPr>
-                <w:rFonts w:ascii="Consolas" w:hAnsi="Consolas" w:eastAsia="Consolas"/>
-                <w:color w:val="F2F2F2"/>
-                <w:sz w:val="19"/>
-              </w:rPr>
-              <w:t>transport lag    +00 00:00:00</w:t>
-            </w:r>
-          </w:p>
-          <w:p>
-            <w:pPr>
-              <w:spacing w:after="0" w:before="0"/>
-            </w:pPr>
-            <w:r>
-              <w:rPr>
-                <w:rFonts w:ascii="Consolas" w:hAnsi="Consolas" w:eastAsia="Consolas"/>
-                <w:color w:val="F2F2F2"/>
-                <w:sz w:val="19"/>
-              </w:rPr>
-              <w:t>apply lag        +00 00:00:00</w:t>
+              <w:t xml:space="preserve">   --&gt; transport lag +00 00:00:00 / apply lag +00 00:00:00</w:t>
             </w:r>
           </w:p>
         </w:tc>
@@ -6495,16 +5888,7 @@
           <w:rFonts w:ascii="맑은 고딕" w:hAnsi="맑은 고딕" w:eastAsia="맑은 고딕"/>
           <w:sz w:val="21"/>
         </w:rPr>
-        <w:t>끊겨 있던 동안의 변경이 따라왔다. **데이터는 잃지 않았다.**</w:t>
-      </w:r>
-    </w:p>
-    <w:p>
-      <w:r>
-        <w:rPr>
-          <w:rFonts w:ascii="맑은 고딕" w:hAnsi="맑은 고딕" w:eastAsia="맑은 고딕"/>
-          <w:sz w:val="21"/>
-        </w:rPr>
-        <w:t>그러나 그동안 재해 복구 능력이 없었다는 사실은 남는다. 이번에는 그것이 **사람의 실수가 아니라 장애**였다.</w:t>
+        <w:t>끊겨 있던 동안의 변경이 따라왔다. **데이터는 잃지 않았다.** 그러나 그동안 재해 복구 능력이 없었다는 사실은 남으며, 이번에는 그것이 **사람의 실수가 아니라 장애**였다.</w:t>
       </w:r>
     </w:p>
     <w:tbl>
@@ -6671,7 +6055,7 @@
           <w:rFonts w:ascii="맑은 고딕" w:hAnsi="맑은 고딕" w:eastAsia="맑은 고딕"/>
           <w:sz w:val="21"/>
         </w:rPr>
-        <w:t>판정의 시차다. Broker 상태는 주기적으로 다시 계산되며 이 출력은 문제가 있던 구간을 반영한다. `status updated 58 seconds ago`가 그 증거다. 잠시 뒤 다시 조회하면 원래대로 돌아온다.</w:t>
+        <w:t>판정의 시차다. Broker 상태는 주기적으로 다시 계산되며 `status updated 58 seconds ago`가 그 증거다. 잠시 뒤 다시 조회하면 돌아온다.</w:t>
       </w:r>
     </w:p>
     <w:tbl>
@@ -6843,7 +6227,7 @@
                 <w:color w:val="F2F2F2"/>
                 <w:sz w:val="19"/>
               </w:rPr>
-              <w:t>SYS@chicago&gt; select name, value from v$parameter where name='log_archive_trace';</w:t>
+              <w:t>SYS@chicago&gt; select value from v$parameter where name='log_archive_trace';</w:t>
             </w:r>
           </w:p>
           <w:p>
@@ -6856,59 +6240,7 @@
                 <w:color w:val="F2F2F2"/>
                 <w:sz w:val="19"/>
               </w:rPr>
-              <w:t xml:space="preserve"> </w:t>
-            </w:r>
-          </w:p>
-          <w:p>
-            <w:pPr>
-              <w:spacing w:after="0" w:before="0"/>
-            </w:pPr>
-            <w:r>
-              <w:rPr>
-                <w:rFonts w:ascii="Consolas" w:hAnsi="Consolas" w:eastAsia="Consolas"/>
-                <w:color w:val="F2F2F2"/>
-                <w:sz w:val="19"/>
-              </w:rPr>
-              <w:t>NAME                 VALUE</w:t>
-            </w:r>
-          </w:p>
-          <w:p>
-            <w:pPr>
-              <w:spacing w:after="0" w:before="0"/>
-            </w:pPr>
-            <w:r>
-              <w:rPr>
-                <w:rFonts w:ascii="Consolas" w:hAnsi="Consolas" w:eastAsia="Consolas"/>
-                <w:color w:val="F2F2F2"/>
-                <w:sz w:val="19"/>
-              </w:rPr>
-              <w:t>-------------------- ------</w:t>
-            </w:r>
-          </w:p>
-          <w:p>
-            <w:pPr>
-              <w:spacing w:after="0" w:before="0"/>
-            </w:pPr>
-            <w:r>
-              <w:rPr>
-                <w:rFonts w:ascii="Consolas" w:hAnsi="Consolas" w:eastAsia="Consolas"/>
-                <w:color w:val="F2F2F2"/>
-                <w:sz w:val="19"/>
-              </w:rPr>
-              <w:t>log_archive_trace    0</w:t>
-            </w:r>
-          </w:p>
-          <w:p>
-            <w:pPr>
-              <w:spacing w:after="0" w:before="0"/>
-            </w:pPr>
-            <w:r>
-              <w:rPr>
-                <w:rFonts w:ascii="Consolas" w:hAnsi="Consolas" w:eastAsia="Consolas"/>
-                <w:color w:val="F2F2F2"/>
-                <w:sz w:val="19"/>
-              </w:rPr>
-              <w:t xml:space="preserve"> </w:t>
+              <w:t xml:space="preserve">   --&gt; 0</w:t>
             </w:r>
           </w:p>
           <w:p>
@@ -7062,7 +6394,7 @@
                 <w:rFonts w:ascii="맑은 고딕" w:hAnsi="맑은 고딕" w:eastAsia="맑은 고딕"/>
                 <w:sz w:val="19"/>
               </w:rPr>
-              <w:t>목적지별 상태, 목적지 활동</w:t>
+              <w:t>목적지별 상태와 활동</w:t>
             </w:r>
           </w:p>
         </w:tc>
@@ -7078,7 +6410,7 @@
                 <w:rFonts w:ascii="맑은 고딕" w:hAnsi="맑은 고딕" w:eastAsia="맑은 고딕"/>
                 <w:sz w:val="19"/>
               </w:rPr>
-              <w:t>`16`</w:t>
+              <w:t>`16` / `128`·`4096`</w:t>
             </w:r>
           </w:p>
         </w:tc>
@@ -7092,37 +6424,7 @@
                 <w:rFonts w:ascii="맑은 고딕" w:hAnsi="맑은 고딕" w:eastAsia="맑은 고딕"/>
                 <w:sz w:val="19"/>
               </w:rPr>
-              <w:t>상세 디버깅</w:t>
-            </w:r>
-          </w:p>
-        </w:tc>
-      </w:tr>
-      <w:tr>
-        <w:tc>
-          <w:tcPr>
-            <w:tcW w:type="dxa" w:w="4320"/>
-          </w:tcPr>
-          <w:p>
-            <w:r>
-              <w:rPr>
-                <w:rFonts w:ascii="맑은 고딕" w:hAnsi="맑은 고딕" w:eastAsia="맑은 고딕"/>
-                <w:sz w:val="19"/>
-              </w:rPr>
-              <w:t>`128`·`4096`</w:t>
-            </w:r>
-          </w:p>
-        </w:tc>
-        <w:tc>
-          <w:tcPr>
-            <w:tcW w:type="dxa" w:w="4320"/>
-          </w:tcPr>
-          <w:p>
-            <w:r>
-              <w:rPr>
-                <w:rFonts w:ascii="맑은 고딕" w:hAnsi="맑은 고딕" w:eastAsia="맑은 고딕"/>
-                <w:sz w:val="19"/>
-              </w:rPr>
-              <w:t>FAL 서버, 실시간 적용</w:t>
+              <w:t>상세 디버깅 / FAL 서버·실시간 적용</w:t>
             </w:r>
           </w:p>
         </w:tc>
@@ -7135,7 +6437,7 @@
           <w:rFonts w:ascii="맑은 고딕" w:hAnsi="맑은 고딕" w:eastAsia="맑은 고딕"/>
           <w:sz w:val="21"/>
         </w:rPr>
-        <w:t>12는 `4 + 8`이며 목적지 상태와 활동을 함께 본다. **동적 파라미터**이므로 재기동이 필요 없고, 알림 로그에 변경 사실이 남는다.</w:t>
+        <w:t>12는 `4 + 8`이다. **동적 파라미터**이므로 재기동이 필요 없고 알림 로그에 변경 사실이 남는다.</w:t>
       </w:r>
     </w:p>
     <w:tbl>
@@ -7264,19 +6566,6 @@
                 <w:color w:val="F2F2F2"/>
                 <w:sz w:val="19"/>
               </w:rPr>
-              <w:t>-rw-r-----. 1 oracle dba 12456 Aug 28 09:39 .../trace/chicago_arc3_2486.trc</w:t>
-            </w:r>
-          </w:p>
-          <w:p>
-            <w:pPr>
-              <w:spacing w:after="0" w:before="0"/>
-            </w:pPr>
-            <w:r>
-              <w:rPr>
-                <w:rFonts w:ascii="Consolas" w:hAnsi="Consolas" w:eastAsia="Consolas"/>
-                <w:color w:val="F2F2F2"/>
-                <w:sz w:val="19"/>
-              </w:rPr>
               <w:t>-rw-r-----. 1 oracle dba  5145 Aug 28 09:38 .../trace/chicago_arc1_2482.trc</w:t>
             </w:r>
           </w:p>
@@ -7290,16 +6579,7 @@
           <w:rFonts w:ascii="맑은 고딕" w:hAnsi="맑은 고딕" w:eastAsia="맑은 고딕"/>
           <w:sz w:val="21"/>
         </w:rPr>
-        <w:t>**프로세스마다 파일이 따로 생긴다.** 이름은 `&lt;SID&gt;_&lt;프로세스&gt;_&lt;PID&gt;.trc`이며 ADR의 trace 디렉터리, 즉 14장에서 `EXPORT CONFIGURATION`이 떨어진 곳과 같다.</w:t>
-      </w:r>
-    </w:p>
-    <w:p>
-      <w:r>
-        <w:rPr>
-          <w:rFonts w:ascii="맑은 고딕" w:hAnsi="맑은 고딕" w:eastAsia="맑은 고딕"/>
-          <w:sz w:val="21"/>
-        </w:rPr>
-        <w:t>알림 로그에서 본 `chicago_arc1_2482.trc`가 이 목록에 있다. **알림 로그가 트레이스 파일 이름을 알려 준다.** 전송 방식에 따라 볼 파일이 다르다.</w:t>
+        <w:t>**프로세스마다 파일이 따로 생긴다.** 이름은 `&lt;SID&gt;_&lt;프로세스&gt;_&lt;PID&gt;.trc`이며 위치는 14장의 `EXPORT CONFIGURATION`과 같은 ADR trace 디렉터리다. 알림 로그에서 본 `chicago_arc1_2482.trc`가 이 목록에 있다. **알림 로그가 파일 이름을 알려 준다.**</w:t>
       </w:r>
     </w:p>
     <w:tbl>
@@ -7524,19 +6804,6 @@
                 <w:color w:val="F2F2F2"/>
                 <w:sz w:val="19"/>
               </w:rPr>
-              <w:t>Successfully acquired LGWR NS Write latch IX+</w:t>
-            </w:r>
-          </w:p>
-          <w:p>
-            <w:pPr>
-              <w:spacing w:after="0" w:before="0"/>
-            </w:pPr>
-            <w:r>
-              <w:rPr>
-                <w:rFonts w:ascii="Consolas" w:hAnsi="Consolas" w:eastAsia="Consolas"/>
-                <w:color w:val="F2F2F2"/>
-                <w:sz w:val="19"/>
-              </w:rPr>
               <w:t>Freeing LGWR NS Write latch [krsu.c:10216] IX0</w:t>
             </w:r>
           </w:p>
@@ -7563,7 +6830,7 @@
           <w:rFonts w:ascii="맑은 고딕" w:hAnsi="맑은 고딕" w:eastAsia="맑은 고딕"/>
           <w:sz w:val="21"/>
         </w:rPr>
-        <w:t>읽기 어렵다. `krsu.c:10213`은 오라클 내부 소스의 위치이며 우리가 해석할 것이 아니다. **그래도 읽을 수 있는 것이 있다.**</w:t>
+        <w:t>읽기 어렵다. `krsu.c:10213`은 내부 소스의 위치이며 해석할 것이 아니다. **그래도 읽을 수 있는 것이 있다.**</w:t>
       </w:r>
     </w:p>
     <w:p>
@@ -7770,7 +7037,7 @@
           <w:rFonts w:ascii="맑은 고딕" w:hAnsi="맑은 고딕" w:eastAsia="맑은 고딕"/>
           <w:sz w:val="21"/>
         </w:rPr>
-        <w:t>음수가 "정수가 아니다"라는 것은 어색하지만 이 파라미터가 **부호 없는 정수**를 받기 때문이다. **오류 메시지가 원인을 정확히 설명하지 않는 예**이며 드물지 않다. 조치는 유효한 값을 주는 것이고 끌 때는 0이다.</w:t>
+        <w:t>음수가 "정수가 아니다"라는 것은 어색하지만 **부호 없는 정수**를 받기 때문이다. **오류 메시지가 원인을 정확히 설명하지 않는 예**다. 끌 때는 0이다.</w:t>
       </w:r>
     </w:p>
     <w:tbl>
@@ -7901,19 +7168,7 @@
                 <w:rFonts w:ascii="맑은 고딕" w:hAnsi="맑은 고딕" w:eastAsia="맑은 고딕"/>
                 <w:sz w:val="20"/>
               </w:rPr>
-              <w:t>**④ 끈 뒤 `V$PARAMETER`로 0인지 확인한다.**</w:t>
-            </w:r>
-          </w:p>
-          <w:p>
-            <w:pPr>
-              <w:spacing w:after="20"/>
-            </w:pPr>
-            <w:r>
-              <w:rPr>
-                <w:rFonts w:ascii="맑은 고딕" w:hAnsi="맑은 고딕" w:eastAsia="맑은 고딕"/>
-                <w:sz w:val="20"/>
-              </w:rPr>
-              <w:t>**⑤ 오래된 트레이스는 `adrci`의 `purge`로 정리한다.**</w:t>
+              <w:t>**④ 끈 뒤 `V$PARAMETER`로 0인지 확인하고, 오래된 트레이스는 `adrci`의 `purge`로 정리한다.**</w:t>
             </w:r>
           </w:p>
         </w:tc>
@@ -7925,7 +7180,1034 @@
         <w:pStyle w:val="Heading2"/>
       </w:pPr>
       <w:r>
-        <w:t>15.6  상시 점검 스크립트</w:t>
+        <w:t>15.6  Logical Standby 는 다른 뷰로 본다</w:t>
+      </w:r>
+    </w:p>
+    <w:p>
+      <w:r>
+        <w:rPr>
+          <w:rFonts w:ascii="맑은 고딕" w:hAnsi="맑은 고딕" w:eastAsia="맑은 고딕"/>
+          <w:sz w:val="21"/>
+        </w:rPr>
+        <w:t>지금까지의 지표는 전부 Physical Standby를 전제로 했다. 12장의 Logical Standby에도 통하는가. boston을 Logical로 바꿔 확인한다.</w:t>
+      </w:r>
+    </w:p>
+    <w:p>
+      <w:pPr>
+        <w:pStyle w:val="Heading3"/>
+      </w:pPr>
+      <w:r>
+        <w:t>15.6.1  익숙한 뷰가 조용해진다</w:t>
+      </w:r>
+    </w:p>
+    <w:tbl>
+      <w:tblPr>
+        <w:tblStyle w:val="TableGrid"/>
+        <w:tblW w:type="auto" w:w="0"/>
+        <w:tblLook w:firstColumn="1" w:firstRow="1" w:lastColumn="0" w:lastRow="0" w:noHBand="0" w:noVBand="1" w:val="04A0"/>
+      </w:tblPr>
+      <w:tblGrid>
+        <w:gridCol w:w="8640"/>
+      </w:tblGrid>
+      <w:tr>
+        <w:tc>
+          <w:tcPr>
+            <w:tcW w:type="dxa" w:w="8640"/>
+            <w:shd w:val="clear" w:color="auto" w:fill="1E1E1E"/>
+          </w:tcPr>
+          <w:p>
+            <w:pPr>
+              <w:spacing w:after="0" w:before="0"/>
+            </w:pPr>
+            <w:r>
+              <w:rPr>
+                <w:rFonts w:ascii="Consolas" w:hAnsi="Consolas" w:eastAsia="Consolas"/>
+                <w:color w:val="F2F2F2"/>
+                <w:sz w:val="19"/>
+              </w:rPr>
+              <w:t>SYS@boston&gt; select database_role, open_mode from v$database;</w:t>
+            </w:r>
+          </w:p>
+          <w:p>
+            <w:pPr>
+              <w:spacing w:after="0" w:before="0"/>
+            </w:pPr>
+            <w:r>
+              <w:rPr>
+                <w:rFonts w:ascii="Consolas" w:hAnsi="Consolas" w:eastAsia="Consolas"/>
+                <w:color w:val="F2F2F2"/>
+                <w:sz w:val="19"/>
+              </w:rPr>
+              <w:t xml:space="preserve"> </w:t>
+            </w:r>
+          </w:p>
+          <w:p>
+            <w:pPr>
+              <w:spacing w:after="0" w:before="0"/>
+            </w:pPr>
+            <w:r>
+              <w:rPr>
+                <w:rFonts w:ascii="Consolas" w:hAnsi="Consolas" w:eastAsia="Consolas"/>
+                <w:color w:val="F2F2F2"/>
+                <w:sz w:val="19"/>
+              </w:rPr>
+              <w:t>DATABASE_ROLE    OPEN_MODE</w:t>
+            </w:r>
+          </w:p>
+          <w:p>
+            <w:pPr>
+              <w:spacing w:after="0" w:before="0"/>
+            </w:pPr>
+            <w:r>
+              <w:rPr>
+                <w:rFonts w:ascii="Consolas" w:hAnsi="Consolas" w:eastAsia="Consolas"/>
+                <w:color w:val="F2F2F2"/>
+                <w:sz w:val="19"/>
+              </w:rPr>
+              <w:t>---------------- -----------</w:t>
+            </w:r>
+          </w:p>
+          <w:p>
+            <w:pPr>
+              <w:spacing w:after="0" w:before="0"/>
+            </w:pPr>
+            <w:r>
+              <w:rPr>
+                <w:rFonts w:ascii="Consolas" w:hAnsi="Consolas" w:eastAsia="Consolas"/>
+                <w:color w:val="F2F2F2"/>
+                <w:sz w:val="19"/>
+              </w:rPr>
+              <w:t>LOGICAL STANDBY  READ WRITE</w:t>
+            </w:r>
+          </w:p>
+          <w:p>
+            <w:pPr>
+              <w:spacing w:after="0" w:before="0"/>
+            </w:pPr>
+            <w:r>
+              <w:rPr>
+                <w:rFonts w:ascii="Consolas" w:hAnsi="Consolas" w:eastAsia="Consolas"/>
+                <w:color w:val="F2F2F2"/>
+                <w:sz w:val="19"/>
+              </w:rPr>
+              <w:t xml:space="preserve"> </w:t>
+            </w:r>
+          </w:p>
+          <w:p>
+            <w:pPr>
+              <w:spacing w:after="0" w:before="0"/>
+            </w:pPr>
+            <w:r>
+              <w:rPr>
+                <w:rFonts w:ascii="Consolas" w:hAnsi="Consolas" w:eastAsia="Consolas"/>
+                <w:color w:val="F2F2F2"/>
+                <w:sz w:val="19"/>
+              </w:rPr>
+              <w:t>SYS@boston&gt; select process, count(*) cnt from v$managed_standby group by process;</w:t>
+            </w:r>
+          </w:p>
+          <w:p>
+            <w:pPr>
+              <w:spacing w:after="0" w:before="0"/>
+            </w:pPr>
+            <w:r>
+              <w:rPr>
+                <w:rFonts w:ascii="Consolas" w:hAnsi="Consolas" w:eastAsia="Consolas"/>
+                <w:color w:val="F2F2F2"/>
+                <w:sz w:val="19"/>
+              </w:rPr>
+              <w:t xml:space="preserve"> </w:t>
+            </w:r>
+          </w:p>
+          <w:p>
+            <w:pPr>
+              <w:spacing w:after="0" w:before="0"/>
+            </w:pPr>
+            <w:r>
+              <w:rPr>
+                <w:rFonts w:ascii="Consolas" w:hAnsi="Consolas" w:eastAsia="Consolas"/>
+                <w:color w:val="F2F2F2"/>
+                <w:sz w:val="19"/>
+              </w:rPr>
+              <w:t>PROCESS          CNT</w:t>
+            </w:r>
+          </w:p>
+          <w:p>
+            <w:pPr>
+              <w:spacing w:after="0" w:before="0"/>
+            </w:pPr>
+            <w:r>
+              <w:rPr>
+                <w:rFonts w:ascii="Consolas" w:hAnsi="Consolas" w:eastAsia="Consolas"/>
+                <w:color w:val="F2F2F2"/>
+                <w:sz w:val="19"/>
+              </w:rPr>
+              <w:t>--------- ----------</w:t>
+            </w:r>
+          </w:p>
+          <w:p>
+            <w:pPr>
+              <w:spacing w:after="0" w:before="0"/>
+            </w:pPr>
+            <w:r>
+              <w:rPr>
+                <w:rFonts w:ascii="Consolas" w:hAnsi="Consolas" w:eastAsia="Consolas"/>
+                <w:color w:val="F2F2F2"/>
+                <w:sz w:val="19"/>
+              </w:rPr>
+              <w:t>ARCH               4</w:t>
+            </w:r>
+          </w:p>
+          <w:p>
+            <w:pPr>
+              <w:spacing w:after="0" w:before="0"/>
+            </w:pPr>
+            <w:r>
+              <w:rPr>
+                <w:rFonts w:ascii="Consolas" w:hAnsi="Consolas" w:eastAsia="Consolas"/>
+                <w:color w:val="F2F2F2"/>
+                <w:sz w:val="19"/>
+              </w:rPr>
+              <w:t>DGRD               2</w:t>
+            </w:r>
+          </w:p>
+          <w:p>
+            <w:pPr>
+              <w:spacing w:after="0" w:before="0"/>
+            </w:pPr>
+            <w:r>
+              <w:rPr>
+                <w:rFonts w:ascii="Consolas" w:hAnsi="Consolas" w:eastAsia="Consolas"/>
+                <w:color w:val="F2F2F2"/>
+                <w:sz w:val="19"/>
+              </w:rPr>
+              <w:t xml:space="preserve"> </w:t>
+            </w:r>
+          </w:p>
+          <w:p>
+            <w:pPr>
+              <w:spacing w:after="0" w:before="0"/>
+            </w:pPr>
+            <w:r>
+              <w:rPr>
+                <w:rFonts w:ascii="Consolas" w:hAnsi="Consolas" w:eastAsia="Consolas"/>
+                <w:color w:val="F2F2F2"/>
+                <w:sz w:val="19"/>
+              </w:rPr>
+              <w:t>SYS@boston&gt; select name, value from v$dataguard_stats;</w:t>
+            </w:r>
+          </w:p>
+          <w:p>
+            <w:pPr>
+              <w:spacing w:after="0" w:before="0"/>
+            </w:pPr>
+            <w:r>
+              <w:rPr>
+                <w:rFonts w:ascii="Consolas" w:hAnsi="Consolas" w:eastAsia="Consolas"/>
+                <w:color w:val="F2F2F2"/>
+                <w:sz w:val="19"/>
+              </w:rPr>
+              <w:t xml:space="preserve"> </w:t>
+            </w:r>
+          </w:p>
+          <w:p>
+            <w:pPr>
+              <w:spacing w:after="0" w:before="0"/>
+            </w:pPr>
+            <w:r>
+              <w:rPr>
+                <w:rFonts w:ascii="Consolas" w:hAnsi="Consolas" w:eastAsia="Consolas"/>
+                <w:color w:val="F2F2F2"/>
+                <w:sz w:val="19"/>
+              </w:rPr>
+              <w:t>no rows selected</w:t>
+            </w:r>
+          </w:p>
+        </w:tc>
+      </w:tr>
+    </w:tbl>
+    <w:p/>
+    <w:p>
+      <w:r>
+        <w:rPr>
+          <w:rFonts w:ascii="맑은 고딕" w:hAnsi="맑은 고딕" w:eastAsia="맑은 고딕"/>
+          <w:sz w:val="21"/>
+        </w:rPr>
+        <w:t>**`MRP0`가 없다.** Logical Standby는 MRP가 아니라 SQL Apply로 적용하므로 `V$MANAGED_STANDBY`에는 `ARCH`와 `DGRD`만 남는다.</w:t>
+      </w:r>
+    </w:p>
+    <w:p>
+      <w:r>
+        <w:rPr>
+          <w:rFonts w:ascii="맑은 고딕" w:hAnsi="맑은 고딕" w:eastAsia="맑은 고딕"/>
+          <w:sz w:val="21"/>
+        </w:rPr>
+        <w:t>더 중요한 것은 그다음이다. **`V$DATAGUARD_STATS`가 `no rows selected`다.** `transport lag`·`apply lag`이 아예 없어 15.7절 점검표의 보조 지표가 통째로 사라진다.</w:t>
+      </w:r>
+    </w:p>
+    <w:p>
+      <w:r>
+        <w:rPr>
+          <w:rFonts w:ascii="맑은 고딕" w:hAnsi="맑은 고딕" w:eastAsia="맑은 고딕"/>
+          <w:sz w:val="21"/>
+        </w:rPr>
+        <w:t>15.2.2절에서 "뷰가 조회된다고 값이 있는 것이 아니다"라고 했는데, 여기서는 **역할이 바뀌면 뷰가 통째로 비어 버린다.** 감시 스크립트가 이것을 장애로 읽으면 안 된다.</w:t>
+      </w:r>
+    </w:p>
+    <w:tbl>
+      <w:tblPr>
+        <w:tblStyle w:val="TableGrid"/>
+        <w:tblW w:type="auto" w:w="0"/>
+        <w:tblLook w:firstColumn="1" w:firstRow="1" w:lastColumn="0" w:lastRow="0" w:noHBand="0" w:noVBand="1" w:val="04A0"/>
+      </w:tblPr>
+      <w:tblGrid>
+        <w:gridCol w:w="2880"/>
+        <w:gridCol w:w="2880"/>
+        <w:gridCol w:w="2880"/>
+      </w:tblGrid>
+      <w:tr>
+        <w:tc>
+          <w:tcPr>
+            <w:tcW w:type="dxa" w:w="2880"/>
+            <w:shd w:val="clear" w:color="auto" w:fill="D9E1F2"/>
+          </w:tcPr>
+          <w:p>
+            <w:r>
+              <w:rPr>
+                <w:rFonts w:ascii="맑은 고딕" w:hAnsi="맑은 고딕" w:eastAsia="맑은 고딕"/>
+                <w:b/>
+                <w:sz w:val="19"/>
+              </w:rPr>
+              <w:t>확인할 것</w:t>
+            </w:r>
+          </w:p>
+        </w:tc>
+        <w:tc>
+          <w:tcPr>
+            <w:tcW w:type="dxa" w:w="2880"/>
+            <w:shd w:val="clear" w:color="auto" w:fill="D9E1F2"/>
+          </w:tcPr>
+          <w:p>
+            <w:r>
+              <w:rPr>
+                <w:rFonts w:ascii="맑은 고딕" w:hAnsi="맑은 고딕" w:eastAsia="맑은 고딕"/>
+                <w:b/>
+                <w:sz w:val="19"/>
+              </w:rPr>
+              <w:t>Physical</w:t>
+            </w:r>
+          </w:p>
+        </w:tc>
+        <w:tc>
+          <w:tcPr>
+            <w:tcW w:type="dxa" w:w="2880"/>
+            <w:shd w:val="clear" w:color="auto" w:fill="D9E1F2"/>
+          </w:tcPr>
+          <w:p>
+            <w:r>
+              <w:rPr>
+                <w:rFonts w:ascii="맑은 고딕" w:hAnsi="맑은 고딕" w:eastAsia="맑은 고딕"/>
+                <w:b/>
+                <w:sz w:val="19"/>
+              </w:rPr>
+              <w:t>Logical</w:t>
+            </w:r>
+          </w:p>
+        </w:tc>
+      </w:tr>
+      <w:tr>
+        <w:tc>
+          <w:tcPr>
+            <w:tcW w:type="dxa" w:w="2880"/>
+          </w:tcPr>
+          <w:p>
+            <w:r>
+              <w:rPr>
+                <w:rFonts w:ascii="맑은 고딕" w:hAnsi="맑은 고딕" w:eastAsia="맑은 고딕"/>
+                <w:sz w:val="19"/>
+              </w:rPr>
+              <w:t>적용 프로세스·상태</w:t>
+            </w:r>
+          </w:p>
+        </w:tc>
+        <w:tc>
+          <w:tcPr>
+            <w:tcW w:type="dxa" w:w="2880"/>
+          </w:tcPr>
+          <w:p>
+            <w:r>
+              <w:rPr>
+                <w:rFonts w:ascii="맑은 고딕" w:hAnsi="맑은 고딕" w:eastAsia="맑은 고딕"/>
+                <w:sz w:val="19"/>
+              </w:rPr>
+              <w:t>`V$MANAGED_STANDBY`의 `MRP0`</w:t>
+            </w:r>
+          </w:p>
+        </w:tc>
+        <w:tc>
+          <w:tcPr>
+            <w:tcW w:type="dxa" w:w="2880"/>
+          </w:tcPr>
+          <w:p>
+            <w:r>
+              <w:rPr>
+                <w:rFonts w:ascii="맑은 고딕" w:hAnsi="맑은 고딕" w:eastAsia="맑은 고딕"/>
+                <w:sz w:val="19"/>
+              </w:rPr>
+              <w:t>`V$LOGSTDBY_PROCESS`·`V$LOGSTDBY_STATE`</w:t>
+            </w:r>
+          </w:p>
+        </w:tc>
+      </w:tr>
+      <w:tr>
+        <w:tc>
+          <w:tcPr>
+            <w:tcW w:type="dxa" w:w="2880"/>
+          </w:tcPr>
+          <w:p>
+            <w:r>
+              <w:rPr>
+                <w:rFonts w:ascii="맑은 고딕" w:hAnsi="맑은 고딕" w:eastAsia="맑은 고딕"/>
+                <w:sz w:val="19"/>
+              </w:rPr>
+              <w:t>지연</w:t>
+            </w:r>
+          </w:p>
+        </w:tc>
+        <w:tc>
+          <w:tcPr>
+            <w:tcW w:type="dxa" w:w="2880"/>
+          </w:tcPr>
+          <w:p>
+            <w:r>
+              <w:rPr>
+                <w:rFonts w:ascii="맑은 고딕" w:hAnsi="맑은 고딕" w:eastAsia="맑은 고딕"/>
+                <w:sz w:val="19"/>
+              </w:rPr>
+              <w:t>`V$DATAGUARD_STATS` 두 값</w:t>
+            </w:r>
+          </w:p>
+        </w:tc>
+        <w:tc>
+          <w:tcPr>
+            <w:tcW w:type="dxa" w:w="2880"/>
+          </w:tcPr>
+          <w:p>
+            <w:r>
+              <w:rPr>
+                <w:rFonts w:ascii="맑은 고딕" w:hAnsi="맑은 고딕" w:eastAsia="맑은 고딕"/>
+                <w:sz w:val="19"/>
+              </w:rPr>
+              <w:t>**없음** (`no rows`)</w:t>
+            </w:r>
+          </w:p>
+        </w:tc>
+      </w:tr>
+      <w:tr>
+        <w:tc>
+          <w:tcPr>
+            <w:tcW w:type="dxa" w:w="2880"/>
+          </w:tcPr>
+          <w:p>
+            <w:r>
+              <w:rPr>
+                <w:rFonts w:ascii="맑은 고딕" w:hAnsi="맑은 고딕" w:eastAsia="맑은 고딕"/>
+                <w:sz w:val="19"/>
+              </w:rPr>
+              <w:t>진행 위치</w:t>
+            </w:r>
+          </w:p>
+        </w:tc>
+        <w:tc>
+          <w:tcPr>
+            <w:tcW w:type="dxa" w:w="2880"/>
+          </w:tcPr>
+          <w:p>
+            <w:r>
+              <w:rPr>
+                <w:rFonts w:ascii="맑은 고딕" w:hAnsi="맑은 고딕" w:eastAsia="맑은 고딕"/>
+                <w:sz w:val="19"/>
+              </w:rPr>
+              <w:t>`MRP0.SEQUENCE#`</w:t>
+            </w:r>
+          </w:p>
+        </w:tc>
+        <w:tc>
+          <w:tcPr>
+            <w:tcW w:type="dxa" w:w="2880"/>
+          </w:tcPr>
+          <w:p>
+            <w:r>
+              <w:rPr>
+                <w:rFonts w:ascii="맑은 고딕" w:hAnsi="맑은 고딕" w:eastAsia="맑은 고딕"/>
+                <w:sz w:val="19"/>
+              </w:rPr>
+              <w:t>`DBA_LOGSTDBY_PROGRESS`의 세 SCN</w:t>
+            </w:r>
+          </w:p>
+        </w:tc>
+      </w:tr>
+    </w:tbl>
+    <w:p/>
+    <w:p>
+      <w:r>
+        <w:rPr>
+          <w:rFonts w:ascii="맑은 고딕" w:hAnsi="맑은 고딕" w:eastAsia="맑은 고딕"/>
+          <w:sz w:val="21"/>
+        </w:rPr>
+        <w:t>`V$LOGSTDBY_STATE`의 `STATE`가 `MRP0` 유무에 해당하는 판정값이다. `IDLE`이 정상, `APPLYING`이 적용 중, **`SQL APPLY NOT ON`이면 멈춘 것**이다.</w:t>
+      </w:r>
+    </w:p>
+    <w:p>
+      <w:pPr>
+        <w:pStyle w:val="Heading3"/>
+      </w:pPr>
+      <w:r>
+        <w:t>15.6.2  V$LOGSTDBY_TRANSACTION — 지금 적용 중인 트랜잭션</w:t>
+      </w:r>
+    </w:p>
+    <w:p>
+      <w:r>
+        <w:rPr>
+          <w:rFonts w:ascii="맑은 고딕" w:hAnsi="맑은 고딕" w:eastAsia="맑은 고딕"/>
+          <w:sz w:val="21"/>
+        </w:rPr>
+        <w:t>Logical Standby에는 Physical에 없는 것이 하나 더 있다. **무엇을 적용하고 있는지 트랜잭션 단위로 볼 수 있다.** 그런데 문서의 열 이름을 그대로 쓰면 조회되지 않는다.</w:t>
+      </w:r>
+    </w:p>
+    <w:tbl>
+      <w:tblPr>
+        <w:tblStyle w:val="TableGrid"/>
+        <w:tblW w:type="auto" w:w="0"/>
+        <w:tblLook w:firstColumn="1" w:firstRow="1" w:lastColumn="0" w:lastRow="0" w:noHBand="0" w:noVBand="1" w:val="04A0"/>
+      </w:tblPr>
+      <w:tblGrid>
+        <w:gridCol w:w="8640"/>
+      </w:tblGrid>
+      <w:tr>
+        <w:tc>
+          <w:tcPr>
+            <w:tcW w:type="dxa" w:w="8640"/>
+            <w:shd w:val="clear" w:color="auto" w:fill="1E1E1E"/>
+          </w:tcPr>
+          <w:p>
+            <w:pPr>
+              <w:spacing w:after="0" w:before="0"/>
+            </w:pPr>
+            <w:r>
+              <w:rPr>
+                <w:rFonts w:ascii="Consolas" w:hAnsi="Consolas" w:eastAsia="Consolas"/>
+                <w:color w:val="F2F2F2"/>
+                <w:sz w:val="19"/>
+              </w:rPr>
+              <w:t>SYS@boston&gt; select xidusn, xidslt, xidsqn from v$logstdby_transaction;</w:t>
+            </w:r>
+          </w:p>
+          <w:p>
+            <w:pPr>
+              <w:spacing w:after="0" w:before="0"/>
+            </w:pPr>
+            <w:r>
+              <w:rPr>
+                <w:rFonts w:ascii="Consolas" w:hAnsi="Consolas" w:eastAsia="Consolas"/>
+                <w:color w:val="F2F2F2"/>
+                <w:sz w:val="19"/>
+              </w:rPr>
+              <w:t xml:space="preserve"> </w:t>
+            </w:r>
+          </w:p>
+          <w:p>
+            <w:pPr>
+              <w:spacing w:after="0" w:before="0"/>
+            </w:pPr>
+            <w:r>
+              <w:rPr>
+                <w:rFonts w:ascii="Consolas" w:hAnsi="Consolas" w:eastAsia="Consolas"/>
+                <w:color w:val="F2F2F2"/>
+                <w:sz w:val="19"/>
+              </w:rPr>
+              <w:t>select xidusn, xidslt, xidsqn from v$logstdby_transaction</w:t>
+            </w:r>
+          </w:p>
+          <w:p>
+            <w:pPr>
+              <w:spacing w:after="0" w:before="0"/>
+            </w:pPr>
+            <w:r>
+              <w:rPr>
+                <w:rFonts w:ascii="Consolas" w:hAnsi="Consolas" w:eastAsia="Consolas"/>
+                <w:color w:val="F2F2F2"/>
+                <w:sz w:val="19"/>
+              </w:rPr>
+              <w:t xml:space="preserve">       *</w:t>
+            </w:r>
+          </w:p>
+          <w:p>
+            <w:pPr>
+              <w:spacing w:after="0" w:before="0"/>
+            </w:pPr>
+            <w:r>
+              <w:rPr>
+                <w:rFonts w:ascii="Consolas" w:hAnsi="Consolas" w:eastAsia="Consolas"/>
+                <w:color w:val="F2F2F2"/>
+                <w:sz w:val="19"/>
+              </w:rPr>
+              <w:t>ERROR at line 1:</w:t>
+            </w:r>
+          </w:p>
+          <w:p>
+            <w:pPr>
+              <w:spacing w:after="0" w:before="0"/>
+            </w:pPr>
+            <w:r>
+              <w:rPr>
+                <w:rFonts w:ascii="Consolas" w:hAnsi="Consolas" w:eastAsia="Consolas"/>
+                <w:color w:val="F2F2F2"/>
+                <w:sz w:val="19"/>
+              </w:rPr>
+              <w:t>ORA-00904: "XIDUSN": invalid identifier</w:t>
+            </w:r>
+          </w:p>
+        </w:tc>
+      </w:tr>
+    </w:tbl>
+    <w:p/>
+    <w:p>
+      <w:r>
+        <w:rPr>
+          <w:rFonts w:ascii="맑은 고딕" w:hAnsi="맑은 고딕" w:eastAsia="맑은 고딕"/>
+          <w:sz w:val="21"/>
+        </w:rPr>
+        <w:t>큰 트랜잭션을 걸고 2초 간격으로 조회하면 행이 잡힌다.</w:t>
+      </w:r>
+    </w:p>
+    <w:tbl>
+      <w:tblPr>
+        <w:tblStyle w:val="TableGrid"/>
+        <w:tblW w:type="auto" w:w="0"/>
+        <w:tblLook w:firstColumn="1" w:firstRow="1" w:lastColumn="0" w:lastRow="0" w:noHBand="0" w:noVBand="1" w:val="04A0"/>
+      </w:tblPr>
+      <w:tblGrid>
+        <w:gridCol w:w="8640"/>
+      </w:tblGrid>
+      <w:tr>
+        <w:tc>
+          <w:tcPr>
+            <w:tcW w:type="dxa" w:w="8640"/>
+            <w:shd w:val="clear" w:color="auto" w:fill="1E1E1E"/>
+          </w:tcPr>
+          <w:p>
+            <w:pPr>
+              <w:spacing w:after="0" w:before="0"/>
+            </w:pPr>
+            <w:r>
+              <w:rPr>
+                <w:rFonts w:ascii="Consolas" w:hAnsi="Consolas" w:eastAsia="Consolas"/>
+                <w:color w:val="F2F2F2"/>
+                <w:sz w:val="19"/>
+              </w:rPr>
+              <w:t>17:20:50 | XID 9.9.821  | DML | MINING COMPLETE | APPLY NONE | SRC_CON 3 | 17:19:58</w:t>
+            </w:r>
+          </w:p>
+          <w:p>
+            <w:pPr>
+              <w:spacing w:after="0" w:before="0"/>
+            </w:pPr>
+            <w:r>
+              <w:rPr>
+                <w:rFonts w:ascii="Consolas" w:hAnsi="Consolas" w:eastAsia="Consolas"/>
+                <w:color w:val="F2F2F2"/>
+                <w:sz w:val="19"/>
+              </w:rPr>
+              <w:t>17:20:50 | XID 9.27.791 | DML | MINING COMPLETE | APPLY NONE | SRC_CON 3 | 17:19:58</w:t>
+            </w:r>
+          </w:p>
+          <w:p>
+            <w:pPr>
+              <w:spacing w:after="0" w:before="0"/>
+            </w:pPr>
+            <w:r>
+              <w:rPr>
+                <w:rFonts w:ascii="Consolas" w:hAnsi="Consolas" w:eastAsia="Consolas"/>
+                <w:color w:val="F2F2F2"/>
+                <w:sz w:val="19"/>
+              </w:rPr>
+              <w:t>17:20:56 | XID 9.32.835 | DML | MINING COMPLETE | APPLY NONE | SRC_CON 3 | 17:20:09</w:t>
+            </w:r>
+          </w:p>
+        </w:tc>
+      </w:tr>
+    </w:tbl>
+    <w:p/>
+    <w:p>
+      <w:r>
+        <w:rPr>
+          <w:rFonts w:ascii="맑은 고딕" w:hAnsi="맑은 고딕" w:eastAsia="맑은 고딕"/>
+          <w:sz w:val="21"/>
+        </w:rPr>
+        <w:t>200만 행을 한 트랜잭션으로 넣었더니 `STATE`가 `APPLYING`인 구간이 **약 2분**이었고 그동안 행이 나타났다 사라졌다. `SRC_CON_ID` **3**은 CDB의 PDB에서 온 변경이라는 뜻이고, `PRIMARY_START_TIME` 17:19:58과 조회 시각 17:20:50의 차이 **52초**가 이 트랜잭션이 붙잡고 있는 시간이다.</w:t>
+      </w:r>
+    </w:p>
+    <w:p>
+      <w:r>
+        <w:rPr>
+          <w:rFonts w:ascii="맑은 고딕" w:hAnsi="맑은 고딕" w:eastAsia="맑은 고딕"/>
+          <w:sz w:val="21"/>
+        </w:rPr>
+        <w:t>한가해지면 이 뷰는 다시 빈다. 그때의 진행은 `DBA_LOGSTDBY_PROGRESS`가 답한다. 실측은 `APPLIED_SCN` 2,988,122 / `READ_SCN` 2,988,125 / `NEWEST_SCN` 2,988,129였다. **세 값이 거의 같으면 따라잡은 것**이고 `NEWEST_SCN`과의 차이가 밀린 양이며, **두 지연을 대신하는 것이 이 세 SCN**이다.</w:t>
+      </w:r>
+    </w:p>
+    <w:p>
+      <w:r>
+        <w:rPr>
+          <w:rFonts w:ascii="맑은 고딕" w:hAnsi="맑은 고딕" w:eastAsia="맑은 고딕"/>
+          <w:sz w:val="21"/>
+        </w:rPr>
+        <w:t>15.3.2절의 `ORA-00904`가 또 나온다. **뷰는 있는데 열 이름이 다르다.** `DESC`로 보면 전부 `PRIMARY_` 접두어가 붙는데, 이 뷰의 XID가 Standby가 아니라 **Primary에서 그 트랜잭션이 받았던 번호**이기 때문이다. 문서의 `SAVEPOINT_SCN`·`COMMIT_SCN`도 19c에는 없다. **열 이름은 외우지 말고 `DESC`로 확인한다.**</w:t>
+      </w:r>
+    </w:p>
+    <w:tbl>
+      <w:tblPr>
+        <w:tblStyle w:val="TableGrid"/>
+        <w:tblW w:type="auto" w:w="0"/>
+        <w:tblLook w:firstColumn="1" w:firstRow="1" w:lastColumn="0" w:lastRow="0" w:noHBand="0" w:noVBand="1" w:val="04A0"/>
+      </w:tblPr>
+      <w:tblGrid>
+        <w:gridCol w:w="2880"/>
+        <w:gridCol w:w="2880"/>
+        <w:gridCol w:w="2880"/>
+      </w:tblGrid>
+      <w:tr>
+        <w:tc>
+          <w:tcPr>
+            <w:tcW w:type="dxa" w:w="2880"/>
+            <w:shd w:val="clear" w:color="auto" w:fill="D9E1F2"/>
+          </w:tcPr>
+          <w:p>
+            <w:r>
+              <w:rPr>
+                <w:rFonts w:ascii="맑은 고딕" w:hAnsi="맑은 고딕" w:eastAsia="맑은 고딕"/>
+                <w:b/>
+                <w:sz w:val="19"/>
+              </w:rPr>
+              <w:t>열</w:t>
+            </w:r>
+          </w:p>
+        </w:tc>
+        <w:tc>
+          <w:tcPr>
+            <w:tcW w:type="dxa" w:w="2880"/>
+            <w:shd w:val="clear" w:color="auto" w:fill="D9E1F2"/>
+          </w:tcPr>
+          <w:p>
+            <w:r>
+              <w:rPr>
+                <w:rFonts w:ascii="맑은 고딕" w:hAnsi="맑은 고딕" w:eastAsia="맑은 고딕"/>
+                <w:b/>
+                <w:sz w:val="19"/>
+              </w:rPr>
+              <w:t>뜻</w:t>
+            </w:r>
+          </w:p>
+        </w:tc>
+        <w:tc>
+          <w:tcPr>
+            <w:tcW w:type="dxa" w:w="2880"/>
+            <w:shd w:val="clear" w:color="auto" w:fill="D9E1F2"/>
+          </w:tcPr>
+          <w:p>
+            <w:r>
+              <w:rPr>
+                <w:rFonts w:ascii="맑은 고딕" w:hAnsi="맑은 고딕" w:eastAsia="맑은 고딕"/>
+                <w:b/>
+                <w:sz w:val="19"/>
+              </w:rPr>
+              <w:t>읽는 법</w:t>
+            </w:r>
+          </w:p>
+        </w:tc>
+      </w:tr>
+      <w:tr>
+        <w:tc>
+          <w:tcPr>
+            <w:tcW w:type="dxa" w:w="2880"/>
+          </w:tcPr>
+          <w:p>
+            <w:r>
+              <w:rPr>
+                <w:rFonts w:ascii="맑은 고딕" w:hAnsi="맑은 고딕" w:eastAsia="맑은 고딕"/>
+                <w:sz w:val="19"/>
+              </w:rPr>
+              <w:t>`PRIMARY_XID*`</w:t>
+            </w:r>
+          </w:p>
+        </w:tc>
+        <w:tc>
+          <w:tcPr>
+            <w:tcW w:type="dxa" w:w="2880"/>
+          </w:tcPr>
+          <w:p>
+            <w:r>
+              <w:rPr>
+                <w:rFonts w:ascii="맑은 고딕" w:hAnsi="맑은 고딕" w:eastAsia="맑은 고딕"/>
+                <w:sz w:val="19"/>
+              </w:rPr>
+              <w:t>Primary에서의 트랜잭션 번호</w:t>
+            </w:r>
+          </w:p>
+        </w:tc>
+        <w:tc>
+          <w:tcPr>
+            <w:tcW w:type="dxa" w:w="2880"/>
+          </w:tcPr>
+          <w:p>
+            <w:r>
+              <w:rPr>
+                <w:rFonts w:ascii="맑은 고딕" w:hAnsi="맑은 고딕" w:eastAsia="맑은 고딕"/>
+                <w:sz w:val="19"/>
+              </w:rPr>
+              <w:t>`usn.slt.sqn` 세 값이 한 벌</w:t>
+            </w:r>
+          </w:p>
+        </w:tc>
+      </w:tr>
+      <w:tr>
+        <w:tc>
+          <w:tcPr>
+            <w:tcW w:type="dxa" w:w="2880"/>
+          </w:tcPr>
+          <w:p>
+            <w:r>
+              <w:rPr>
+                <w:rFonts w:ascii="맑은 고딕" w:hAnsi="맑은 고딕" w:eastAsia="맑은 고딕"/>
+                <w:sz w:val="19"/>
+              </w:rPr>
+              <w:t>`PRIMARY_START_TIME`</w:t>
+            </w:r>
+          </w:p>
+        </w:tc>
+        <w:tc>
+          <w:tcPr>
+            <w:tcW w:type="dxa" w:w="2880"/>
+          </w:tcPr>
+          <w:p>
+            <w:r>
+              <w:rPr>
+                <w:rFonts w:ascii="맑은 고딕" w:hAnsi="맑은 고딕" w:eastAsia="맑은 고딕"/>
+                <w:sz w:val="19"/>
+              </w:rPr>
+              <w:t>Primary에서 시작한 시각</w:t>
+            </w:r>
+          </w:p>
+        </w:tc>
+        <w:tc>
+          <w:tcPr>
+            <w:tcW w:type="dxa" w:w="2880"/>
+          </w:tcPr>
+          <w:p>
+            <w:r>
+              <w:rPr>
+                <w:rFonts w:ascii="맑은 고딕" w:hAnsi="맑은 고딕" w:eastAsia="맑은 고딕"/>
+                <w:sz w:val="19"/>
+              </w:rPr>
+              <w:t>지금 시각과 빼면 **얼마나 오래 걸리는지**</w:t>
+            </w:r>
+          </w:p>
+        </w:tc>
+      </w:tr>
+      <w:tr>
+        <w:tc>
+          <w:tcPr>
+            <w:tcW w:type="dxa" w:w="2880"/>
+          </w:tcPr>
+          <w:p>
+            <w:r>
+              <w:rPr>
+                <w:rFonts w:ascii="맑은 고딕" w:hAnsi="맑은 고딕" w:eastAsia="맑은 고딕"/>
+                <w:sz w:val="19"/>
+              </w:rPr>
+              <w:t>`TYPE`</w:t>
+            </w:r>
+          </w:p>
+        </w:tc>
+        <w:tc>
+          <w:tcPr>
+            <w:tcW w:type="dxa" w:w="2880"/>
+          </w:tcPr>
+          <w:p>
+            <w:r>
+              <w:rPr>
+                <w:rFonts w:ascii="맑은 고딕" w:hAnsi="맑은 고딕" w:eastAsia="맑은 고딕"/>
+                <w:sz w:val="19"/>
+              </w:rPr>
+              <w:t>트랜잭션의 종류</w:t>
+            </w:r>
+          </w:p>
+        </w:tc>
+        <w:tc>
+          <w:tcPr>
+            <w:tcW w:type="dxa" w:w="2880"/>
+          </w:tcPr>
+          <w:p>
+            <w:r>
+              <w:rPr>
+                <w:rFonts w:ascii="맑은 고딕" w:hAnsi="맑은 고딕" w:eastAsia="맑은 고딕"/>
+                <w:sz w:val="19"/>
+              </w:rPr>
+              <w:t>실측 `DML`. DDL이면 `DDL`</w:t>
+            </w:r>
+          </w:p>
+        </w:tc>
+      </w:tr>
+      <w:tr>
+        <w:tc>
+          <w:tcPr>
+            <w:tcW w:type="dxa" w:w="2880"/>
+          </w:tcPr>
+          <w:p>
+            <w:r>
+              <w:rPr>
+                <w:rFonts w:ascii="맑은 고딕" w:hAnsi="맑은 고딕" w:eastAsia="맑은 고딕"/>
+                <w:sz w:val="19"/>
+              </w:rPr>
+              <w:t>`MINING_STATUS`·`APPLY_STATUS`</w:t>
+            </w:r>
+          </w:p>
+        </w:tc>
+        <w:tc>
+          <w:tcPr>
+            <w:tcW w:type="dxa" w:w="2880"/>
+          </w:tcPr>
+          <w:p>
+            <w:r>
+              <w:rPr>
+                <w:rFonts w:ascii="맑은 고딕" w:hAnsi="맑은 고딕" w:eastAsia="맑은 고딕"/>
+                <w:sz w:val="19"/>
+              </w:rPr>
+              <w:t>읽는 단계·적용 단계</w:t>
+            </w:r>
+          </w:p>
+        </w:tc>
+        <w:tc>
+          <w:tcPr>
+            <w:tcW w:type="dxa" w:w="2880"/>
+          </w:tcPr>
+          <w:p>
+            <w:r>
+              <w:rPr>
+                <w:rFonts w:ascii="맑은 고딕" w:hAnsi="맑은 고딕" w:eastAsia="맑은 고딕"/>
+                <w:sz w:val="19"/>
+              </w:rPr>
+              <w:t>실측 `MINING COMPLETE`/`APPLY NONE`</w:t>
+            </w:r>
+          </w:p>
+        </w:tc>
+      </w:tr>
+      <w:tr>
+        <w:tc>
+          <w:tcPr>
+            <w:tcW w:type="dxa" w:w="2880"/>
+          </w:tcPr>
+          <w:p>
+            <w:r>
+              <w:rPr>
+                <w:rFonts w:ascii="맑은 고딕" w:hAnsi="맑은 고딕" w:eastAsia="맑은 고딕"/>
+                <w:sz w:val="19"/>
+              </w:rPr>
+              <w:t>`SRC_CON_ID`</w:t>
+            </w:r>
+          </w:p>
+        </w:tc>
+        <w:tc>
+          <w:tcPr>
+            <w:tcW w:type="dxa" w:w="2880"/>
+          </w:tcPr>
+          <w:p>
+            <w:r>
+              <w:rPr>
+                <w:rFonts w:ascii="맑은 고딕" w:hAnsi="맑은 고딕" w:eastAsia="맑은 고딕"/>
+                <w:sz w:val="19"/>
+              </w:rPr>
+              <w:t>어느 PDB에서 왔는가</w:t>
+            </w:r>
+          </w:p>
+        </w:tc>
+        <w:tc>
+          <w:tcPr>
+            <w:tcW w:type="dxa" w:w="2880"/>
+          </w:tcPr>
+          <w:p>
+            <w:r>
+              <w:rPr>
+                <w:rFonts w:ascii="맑은 고딕" w:hAnsi="맑은 고딕" w:eastAsia="맑은 고딕"/>
+                <w:sz w:val="19"/>
+              </w:rPr>
+              <w:t>CDB에서만 의미가 있다</w:t>
+            </w:r>
+          </w:p>
+        </w:tc>
+      </w:tr>
+    </w:tbl>
+    <w:p/>
+    <w:tbl>
+      <w:tblPr>
+        <w:tblStyle w:val="TableGrid"/>
+        <w:tblW w:type="auto" w:w="0"/>
+        <w:tblLook w:firstColumn="1" w:firstRow="1" w:lastColumn="0" w:lastRow="0" w:noHBand="0" w:noVBand="1" w:val="04A0"/>
+      </w:tblPr>
+      <w:tblGrid>
+        <w:gridCol w:w="8640"/>
+      </w:tblGrid>
+      <w:tr>
+        <w:tc>
+          <w:tcPr>
+            <w:tcW w:type="dxa" w:w="8640"/>
+            <w:shd w:val="clear" w:color="auto" w:fill="E3F0DB"/>
+          </w:tcPr>
+          <w:p>
+            <w:r>
+              <w:rPr>
+                <w:rFonts w:ascii="맑은 고딕" w:hAnsi="맑은 고딕" w:eastAsia="맑은 고딕"/>
+                <w:b/>
+                <w:sz w:val="21"/>
+              </w:rPr>
+              <w:t>Best Practice · 이 뷰를 언제 보는가</w:t>
+            </w:r>
+          </w:p>
+          <w:p>
+            <w:pPr>
+              <w:spacing w:after="20"/>
+            </w:pPr>
+            <w:r>
+              <w:rPr>
+                <w:rFonts w:ascii="맑은 고딕" w:hAnsi="맑은 고딕" w:eastAsia="맑은 고딕"/>
+                <w:sz w:val="20"/>
+              </w:rPr>
+              <w:t>**① 적용이 느릴 때.** `STATE`가 `APPLYING`인데 진도가 안 나가면 **큰 트랜잭션 하나가 잡고 있는지** 본다. `PRIMARY_START_TIME`이 오래됐으면 그것이다.</w:t>
+            </w:r>
+          </w:p>
+          <w:p>
+            <w:pPr>
+              <w:spacing w:after="20"/>
+            </w:pPr>
+            <w:r>
+              <w:rPr>
+                <w:rFonts w:ascii="맑은 고딕" w:hAnsi="맑은 고딕" w:eastAsia="맑은 고딕"/>
+                <w:sz w:val="20"/>
+              </w:rPr>
+              <w:t>**② 멈췄을 때는 이 뷰가 답하지 않는다.** 적용이 멈추면 **`no rows selected`가 되므로** 문제의 XID는 `DBA_LOGSTDBY_EVENTS`에서 찾는다. 실습 07에서 확인한다.</w:t>
+            </w:r>
+          </w:p>
+        </w:tc>
+      </w:tr>
+    </w:tbl>
+    <w:p/>
+    <w:p>
+      <w:pPr>
+        <w:pStyle w:val="Heading2"/>
+      </w:pPr>
+      <w:r>
+        <w:t>15.7  상시 점검 스크립트</w:t>
       </w:r>
     </w:p>
     <w:p>
@@ -7942,7 +8224,7 @@
         <w:pStyle w:val="Heading3"/>
       </w:pPr>
       <w:r>
-        <w:t>15.6.1  설계 원칙</w:t>
+        <w:t>15.7.1  설계 원칙</w:t>
       </w:r>
     </w:p>
     <w:p>
@@ -8010,7 +8292,7 @@
         <w:pStyle w:val="Heading3"/>
       </w:pPr>
       <w:r>
-        <w:t>15.6.2  Primary 쪽</w:t>
+        <w:t>15.7.2  Primary 쪽</w:t>
       </w:r>
     </w:p>
     <w:tbl>
@@ -8038,7 +8320,7 @@
                 <w:color w:val="F2F2F2"/>
                 <w:sz w:val="19"/>
               </w:rPr>
-              <w:t>SYS@chicago&gt; select database_role||' / '||open_mode||' / '||protection_mode info</w:t>
+              <w:t>select database_role||' / '||open_mode||' / '||protection_mode info from v$database;</w:t>
             </w:r>
           </w:p>
           <w:p>
@@ -8051,7 +8333,7 @@
                 <w:color w:val="F2F2F2"/>
                 <w:sz w:val="19"/>
               </w:rPr>
-              <w:t xml:space="preserve">  2            from v$database;</w:t>
+              <w:t xml:space="preserve">   --&gt; PRIMARY / READ WRITE / MAXIMUM PERFORMANCE</w:t>
             </w:r>
           </w:p>
           <w:p>
@@ -8064,7 +8346,7 @@
                 <w:color w:val="F2F2F2"/>
                 <w:sz w:val="19"/>
               </w:rPr>
-              <w:t xml:space="preserve"> </w:t>
+              <w:t>select dest_id, status, error from v$archive_dest_status where dest_id in (1,2);</w:t>
             </w:r>
           </w:p>
           <w:p>
@@ -8077,7 +8359,7 @@
                 <w:color w:val="F2F2F2"/>
                 <w:sz w:val="19"/>
               </w:rPr>
-              <w:t>INFO</w:t>
+              <w:t xml:space="preserve">   --&gt; 1 VALID / 2 VALID</w:t>
             </w:r>
           </w:p>
           <w:p>
@@ -8090,7 +8372,7 @@
                 <w:color w:val="F2F2F2"/>
                 <w:sz w:val="19"/>
               </w:rPr>
-              <w:t>--------------------------------------------------------------</w:t>
+              <w:t>select count(*) log_abnormal from v$logfile where status is not null;</w:t>
             </w:r>
           </w:p>
           <w:p>
@@ -8103,7 +8385,7 @@
                 <w:color w:val="F2F2F2"/>
                 <w:sz w:val="19"/>
               </w:rPr>
-              <w:t>PRIMARY / READ WRITE / MAXIMUM PERFORMANCE</w:t>
+              <w:t>select count(*) dg_err from v$dataguard_status</w:t>
             </w:r>
           </w:p>
           <w:p>
@@ -8116,7 +8398,7 @@
                 <w:color w:val="F2F2F2"/>
                 <w:sz w:val="19"/>
               </w:rPr>
-              <w:t xml:space="preserve"> </w:t>
+              <w:t xml:space="preserve">       where error_code&lt;&gt;0 and timestamp&gt;sysdate-1/24;</w:t>
             </w:r>
           </w:p>
           <w:p>
@@ -8129,7 +8411,7 @@
                 <w:color w:val="F2F2F2"/>
                 <w:sz w:val="19"/>
               </w:rPr>
-              <w:t>SYS@chicago&gt; select dest_id, destination, status, error</w:t>
+              <w:t>select max(sequence#) cur_seq from v$log where status='CURRENT';</w:t>
             </w:r>
           </w:p>
           <w:p>
@@ -8142,189 +8424,7 @@
                 <w:color w:val="F2F2F2"/>
                 <w:sz w:val="19"/>
               </w:rPr>
-              <w:t xml:space="preserve">  2            from v$archive_dest_status where dest_id in (1,2);</w:t>
-            </w:r>
-          </w:p>
-          <w:p>
-            <w:pPr>
-              <w:spacing w:after="0" w:before="0"/>
-            </w:pPr>
-            <w:r>
-              <w:rPr>
-                <w:rFonts w:ascii="Consolas" w:hAnsi="Consolas" w:eastAsia="Consolas"/>
-                <w:color w:val="F2F2F2"/>
-                <w:sz w:val="19"/>
-              </w:rPr>
-              <w:t xml:space="preserve"> </w:t>
-            </w:r>
-          </w:p>
-          <w:p>
-            <w:pPr>
-              <w:spacing w:after="0" w:before="0"/>
-            </w:pPr>
-            <w:r>
-              <w:rPr>
-                <w:rFonts w:ascii="Consolas" w:hAnsi="Consolas" w:eastAsia="Consolas"/>
-                <w:color w:val="F2F2F2"/>
-                <w:sz w:val="19"/>
-              </w:rPr>
-              <w:t xml:space="preserve">   DEST_ID DESTINATION  STATUS    ERROR</w:t>
-            </w:r>
-          </w:p>
-          <w:p>
-            <w:pPr>
-              <w:spacing w:after="0" w:before="0"/>
-            </w:pPr>
-            <w:r>
-              <w:rPr>
-                <w:rFonts w:ascii="Consolas" w:hAnsi="Consolas" w:eastAsia="Consolas"/>
-                <w:color w:val="F2F2F2"/>
-                <w:sz w:val="19"/>
-              </w:rPr>
-              <w:t>---------- ------------ --------- --------</w:t>
-            </w:r>
-          </w:p>
-          <w:p>
-            <w:pPr>
-              <w:spacing w:after="0" w:before="0"/>
-            </w:pPr>
-            <w:r>
-              <w:rPr>
-                <w:rFonts w:ascii="Consolas" w:hAnsi="Consolas" w:eastAsia="Consolas"/>
-                <w:color w:val="F2F2F2"/>
-                <w:sz w:val="19"/>
-              </w:rPr>
-              <w:t xml:space="preserve">         1              VALID</w:t>
-            </w:r>
-          </w:p>
-          <w:p>
-            <w:pPr>
-              <w:spacing w:after="0" w:before="0"/>
-            </w:pPr>
-            <w:r>
-              <w:rPr>
-                <w:rFonts w:ascii="Consolas" w:hAnsi="Consolas" w:eastAsia="Consolas"/>
-                <w:color w:val="F2F2F2"/>
-                <w:sz w:val="19"/>
-              </w:rPr>
-              <w:t xml:space="preserve">         2 boston       VALID</w:t>
-            </w:r>
-          </w:p>
-          <w:p>
-            <w:pPr>
-              <w:spacing w:after="0" w:before="0"/>
-            </w:pPr>
-            <w:r>
-              <w:rPr>
-                <w:rFonts w:ascii="Consolas" w:hAnsi="Consolas" w:eastAsia="Consolas"/>
-                <w:color w:val="F2F2F2"/>
-                <w:sz w:val="19"/>
-              </w:rPr>
-              <w:t xml:space="preserve"> </w:t>
-            </w:r>
-          </w:p>
-          <w:p>
-            <w:pPr>
-              <w:spacing w:after="0" w:before="0"/>
-            </w:pPr>
-            <w:r>
-              <w:rPr>
-                <w:rFonts w:ascii="Consolas" w:hAnsi="Consolas" w:eastAsia="Consolas"/>
-                <w:color w:val="F2F2F2"/>
-                <w:sz w:val="19"/>
-              </w:rPr>
-              <w:t>SYS@chicago&gt; select count(*) log_abnormal from v$logfile where status is not null;</w:t>
-            </w:r>
-          </w:p>
-          <w:p>
-            <w:pPr>
-              <w:spacing w:after="0" w:before="0"/>
-            </w:pPr>
-            <w:r>
-              <w:rPr>
-                <w:rFonts w:ascii="Consolas" w:hAnsi="Consolas" w:eastAsia="Consolas"/>
-                <w:color w:val="F2F2F2"/>
-                <w:sz w:val="19"/>
-              </w:rPr>
-              <w:t>SYS@chicago&gt; select count(*) dg_err from v$dataguard_status</w:t>
-            </w:r>
-          </w:p>
-          <w:p>
-            <w:pPr>
-              <w:spacing w:after="0" w:before="0"/>
-            </w:pPr>
-            <w:r>
-              <w:rPr>
-                <w:rFonts w:ascii="Consolas" w:hAnsi="Consolas" w:eastAsia="Consolas"/>
-                <w:color w:val="F2F2F2"/>
-                <w:sz w:val="19"/>
-              </w:rPr>
-              <w:t xml:space="preserve">  2            where error_code&lt;&gt;0 and timestamp&gt;sysdate-1/24;</w:t>
-            </w:r>
-          </w:p>
-          <w:p>
-            <w:pPr>
-              <w:spacing w:after="0" w:before="0"/>
-            </w:pPr>
-            <w:r>
-              <w:rPr>
-                <w:rFonts w:ascii="Consolas" w:hAnsi="Consolas" w:eastAsia="Consolas"/>
-                <w:color w:val="F2F2F2"/>
-                <w:sz w:val="19"/>
-              </w:rPr>
-              <w:t>SYS@chicago&gt; select max(sequence#) cur_seq from v$log where status='CURRENT';</w:t>
-            </w:r>
-          </w:p>
-          <w:p>
-            <w:pPr>
-              <w:spacing w:after="0" w:before="0"/>
-            </w:pPr>
-            <w:r>
-              <w:rPr>
-                <w:rFonts w:ascii="Consolas" w:hAnsi="Consolas" w:eastAsia="Consolas"/>
-                <w:color w:val="F2F2F2"/>
-                <w:sz w:val="19"/>
-              </w:rPr>
-              <w:t xml:space="preserve"> </w:t>
-            </w:r>
-          </w:p>
-          <w:p>
-            <w:pPr>
-              <w:spacing w:after="0" w:before="0"/>
-            </w:pPr>
-            <w:r>
-              <w:rPr>
-                <w:rFonts w:ascii="Consolas" w:hAnsi="Consolas" w:eastAsia="Consolas"/>
-                <w:color w:val="F2F2F2"/>
-                <w:sz w:val="19"/>
-              </w:rPr>
-              <w:t>LOG_ABNORMAL      DG_ERR     CUR_SEQ</w:t>
-            </w:r>
-          </w:p>
-          <w:p>
-            <w:pPr>
-              <w:spacing w:after="0" w:before="0"/>
-            </w:pPr>
-            <w:r>
-              <w:rPr>
-                <w:rFonts w:ascii="Consolas" w:hAnsi="Consolas" w:eastAsia="Consolas"/>
-                <w:color w:val="F2F2F2"/>
-                <w:sz w:val="19"/>
-              </w:rPr>
-              <w:t>------------  ----------  ----------</w:t>
-            </w:r>
-          </w:p>
-          <w:p>
-            <w:pPr>
-              <w:spacing w:after="0" w:before="0"/>
-            </w:pPr>
-            <w:r>
-              <w:rPr>
-                <w:rFonts w:ascii="Consolas" w:hAnsi="Consolas" w:eastAsia="Consolas"/>
-                <w:color w:val="F2F2F2"/>
-                <w:sz w:val="19"/>
-              </w:rPr>
-              <w:t xml:space="preserve">           0           3          83</w:t>
+              <w:t xml:space="preserve">   --&gt; LOG_ABNORMAL 0 / DG_ERR 3 / CUR_SEQ 83</w:t>
             </w:r>
           </w:p>
         </w:tc>
@@ -8576,7 +8676,7 @@
           <w:rFonts w:ascii="맑은 고딕" w:hAnsi="맑은 고딕" w:eastAsia="맑은 고딕"/>
           <w:sz w:val="21"/>
         </w:rPr>
-        <w:t>**`DG_ERR`가 3으로 나왔다.** 리스너를 내렸던 흔적이며 ORA-12541 세 건이다. 시간 조건이 있으므로 한 시간 뒤 자동으로 0이 된다. 이 값이 **"지금 봐야 할 일이 있는가"를 숫자 하나로 답한다.**</w:t>
+        <w:t>**`DG_ERR`가 3으로 나왔다.** 리스너를 내렸던 흔적이며 시간 조건이 있어 한 시간 뒤 0이 된다. 이 값이 **"지금 봐야 할 일이 있는가"를 숫자 하나로 답한다.**</w:t>
       </w:r>
     </w:p>
     <w:p>
@@ -8584,7 +8684,7 @@
         <w:pStyle w:val="Heading3"/>
       </w:pPr>
       <w:r>
-        <w:t>15.6.3  Standby 쪽</w:t>
+        <w:t>15.7.3  Standby 쪽</w:t>
       </w:r>
     </w:p>
     <w:tbl>
@@ -8612,7 +8712,7 @@
                 <w:color w:val="F2F2F2"/>
                 <w:sz w:val="19"/>
               </w:rPr>
-              <w:t>SYS@boston&gt; select database_role||' / '||open_mode info from v$database;</w:t>
+              <w:t>select database_role||' / '||open_mode info from v$database;</w:t>
             </w:r>
           </w:p>
           <w:p>
@@ -8625,7 +8725,7 @@
                 <w:color w:val="F2F2F2"/>
                 <w:sz w:val="19"/>
               </w:rPr>
-              <w:t xml:space="preserve"> </w:t>
+              <w:t xml:space="preserve">   --&gt; PHYSICAL STANDBY / READ ONLY WITH APPLY</w:t>
             </w:r>
           </w:p>
           <w:p>
@@ -8638,7 +8738,7 @@
                 <w:color w:val="F2F2F2"/>
                 <w:sz w:val="19"/>
               </w:rPr>
-              <w:t>INFO</w:t>
+              <w:t>select process, status, sequence# from v$managed_standby where process='MRP0';</w:t>
             </w:r>
           </w:p>
           <w:p>
@@ -8651,7 +8751,7 @@
                 <w:color w:val="F2F2F2"/>
                 <w:sz w:val="19"/>
               </w:rPr>
-              <w:t>---------------------------------------</w:t>
+              <w:t xml:space="preserve">   --&gt; MRP0 APPLYING_LOG 83</w:t>
             </w:r>
           </w:p>
           <w:p>
@@ -8664,7 +8764,7 @@
                 <w:color w:val="F2F2F2"/>
                 <w:sz w:val="19"/>
               </w:rPr>
-              <w:t>PHYSICAL STANDBY / READ ONLY WITH APPLY</w:t>
+              <w:t>select status, recovery_mode from v$archive_dest_status where dest_id=1;</w:t>
             </w:r>
           </w:p>
           <w:p>
@@ -8677,7 +8777,7 @@
                 <w:color w:val="F2F2F2"/>
                 <w:sz w:val="19"/>
               </w:rPr>
-              <w:t xml:space="preserve"> </w:t>
+              <w:t xml:space="preserve">   --&gt; VALID / MANAGED REAL TIME APPLY</w:t>
             </w:r>
           </w:p>
           <w:p>
@@ -8690,7 +8790,7 @@
                 <w:color w:val="F2F2F2"/>
                 <w:sz w:val="19"/>
               </w:rPr>
-              <w:t>SYS@boston&gt; select process, status, sequence# from v$managed_standby</w:t>
+              <w:t>select count(*) srl_active from v$standby_log where status='ACTIVE';</w:t>
             </w:r>
           </w:p>
           <w:p>
@@ -8703,7 +8803,7 @@
                 <w:color w:val="F2F2F2"/>
                 <w:sz w:val="19"/>
               </w:rPr>
-              <w:t xml:space="preserve">  2            where process='MRP0';</w:t>
+              <w:t>select count(*) gap_cnt from v$archive_gap;</w:t>
             </w:r>
           </w:p>
           <w:p>
@@ -8716,7 +8816,7 @@
                 <w:color w:val="F2F2F2"/>
                 <w:sz w:val="19"/>
               </w:rPr>
-              <w:t xml:space="preserve"> </w:t>
+              <w:t>select count(*) dg_err from v$dataguard_status</w:t>
             </w:r>
           </w:p>
           <w:p>
@@ -8729,7 +8829,7 @@
                 <w:color w:val="F2F2F2"/>
                 <w:sz w:val="19"/>
               </w:rPr>
-              <w:t>PROCESS   STATUS         SEQUENCE#</w:t>
+              <w:t xml:space="preserve">       where error_code&lt;&gt;0 and timestamp&gt;sysdate-1/24;</w:t>
             </w:r>
           </w:p>
           <w:p>
@@ -8742,228 +8842,7 @@
                 <w:color w:val="F2F2F2"/>
                 <w:sz w:val="19"/>
               </w:rPr>
-              <w:t>--------- ------------ ----------</w:t>
-            </w:r>
-          </w:p>
-          <w:p>
-            <w:pPr>
-              <w:spacing w:after="0" w:before="0"/>
-            </w:pPr>
-            <w:r>
-              <w:rPr>
-                <w:rFonts w:ascii="Consolas" w:hAnsi="Consolas" w:eastAsia="Consolas"/>
-                <w:color w:val="F2F2F2"/>
-                <w:sz w:val="19"/>
-              </w:rPr>
-              <w:t>MRP0      APPLYING_LOG         83</w:t>
-            </w:r>
-          </w:p>
-          <w:p>
-            <w:pPr>
-              <w:spacing w:after="0" w:before="0"/>
-            </w:pPr>
-            <w:r>
-              <w:rPr>
-                <w:rFonts w:ascii="Consolas" w:hAnsi="Consolas" w:eastAsia="Consolas"/>
-                <w:color w:val="F2F2F2"/>
-                <w:sz w:val="19"/>
-              </w:rPr>
-              <w:t xml:space="preserve"> </w:t>
-            </w:r>
-          </w:p>
-          <w:p>
-            <w:pPr>
-              <w:spacing w:after="0" w:before="0"/>
-            </w:pPr>
-            <w:r>
-              <w:rPr>
-                <w:rFonts w:ascii="Consolas" w:hAnsi="Consolas" w:eastAsia="Consolas"/>
-                <w:color w:val="F2F2F2"/>
-                <w:sz w:val="19"/>
-              </w:rPr>
-              <w:t>SYS@boston&gt; select dest_id, status, recovery_mode</w:t>
-            </w:r>
-          </w:p>
-          <w:p>
-            <w:pPr>
-              <w:spacing w:after="0" w:before="0"/>
-            </w:pPr>
-            <w:r>
-              <w:rPr>
-                <w:rFonts w:ascii="Consolas" w:hAnsi="Consolas" w:eastAsia="Consolas"/>
-                <w:color w:val="F2F2F2"/>
-                <w:sz w:val="19"/>
-              </w:rPr>
-              <w:t xml:space="preserve">  2            from v$archive_dest_status where dest_id=1;</w:t>
-            </w:r>
-          </w:p>
-          <w:p>
-            <w:pPr>
-              <w:spacing w:after="0" w:before="0"/>
-            </w:pPr>
-            <w:r>
-              <w:rPr>
-                <w:rFonts w:ascii="Consolas" w:hAnsi="Consolas" w:eastAsia="Consolas"/>
-                <w:color w:val="F2F2F2"/>
-                <w:sz w:val="19"/>
-              </w:rPr>
-              <w:t xml:space="preserve"> </w:t>
-            </w:r>
-          </w:p>
-          <w:p>
-            <w:pPr>
-              <w:spacing w:after="0" w:before="0"/>
-            </w:pPr>
-            <w:r>
-              <w:rPr>
-                <w:rFonts w:ascii="Consolas" w:hAnsi="Consolas" w:eastAsia="Consolas"/>
-                <w:color w:val="F2F2F2"/>
-                <w:sz w:val="19"/>
-              </w:rPr>
-              <w:t xml:space="preserve">   DEST_ID STATUS    RECOVERY_MODE</w:t>
-            </w:r>
-          </w:p>
-          <w:p>
-            <w:pPr>
-              <w:spacing w:after="0" w:before="0"/>
-            </w:pPr>
-            <w:r>
-              <w:rPr>
-                <w:rFonts w:ascii="Consolas" w:hAnsi="Consolas" w:eastAsia="Consolas"/>
-                <w:color w:val="F2F2F2"/>
-                <w:sz w:val="19"/>
-              </w:rPr>
-              <w:t>---------- --------- --------------------------</w:t>
-            </w:r>
-          </w:p>
-          <w:p>
-            <w:pPr>
-              <w:spacing w:after="0" w:before="0"/>
-            </w:pPr>
-            <w:r>
-              <w:rPr>
-                <w:rFonts w:ascii="Consolas" w:hAnsi="Consolas" w:eastAsia="Consolas"/>
-                <w:color w:val="F2F2F2"/>
-                <w:sz w:val="19"/>
-              </w:rPr>
-              <w:t xml:space="preserve">         1 VALID     MANAGED REAL TIME APPLY</w:t>
-            </w:r>
-          </w:p>
-          <w:p>
-            <w:pPr>
-              <w:spacing w:after="0" w:before="0"/>
-            </w:pPr>
-            <w:r>
-              <w:rPr>
-                <w:rFonts w:ascii="Consolas" w:hAnsi="Consolas" w:eastAsia="Consolas"/>
-                <w:color w:val="F2F2F2"/>
-                <w:sz w:val="19"/>
-              </w:rPr>
-              <w:t xml:space="preserve"> </w:t>
-            </w:r>
-          </w:p>
-          <w:p>
-            <w:pPr>
-              <w:spacing w:after="0" w:before="0"/>
-            </w:pPr>
-            <w:r>
-              <w:rPr>
-                <w:rFonts w:ascii="Consolas" w:hAnsi="Consolas" w:eastAsia="Consolas"/>
-                <w:color w:val="F2F2F2"/>
-                <w:sz w:val="19"/>
-              </w:rPr>
-              <w:t>SYS@boston&gt; select count(*) srl_active from v$standby_log where status='ACTIVE';</w:t>
-            </w:r>
-          </w:p>
-          <w:p>
-            <w:pPr>
-              <w:spacing w:after="0" w:before="0"/>
-            </w:pPr>
-            <w:r>
-              <w:rPr>
-                <w:rFonts w:ascii="Consolas" w:hAnsi="Consolas" w:eastAsia="Consolas"/>
-                <w:color w:val="F2F2F2"/>
-                <w:sz w:val="19"/>
-              </w:rPr>
-              <w:t>SYS@boston&gt; select count(*) gap_cnt from v$archive_gap;</w:t>
-            </w:r>
-          </w:p>
-          <w:p>
-            <w:pPr>
-              <w:spacing w:after="0" w:before="0"/>
-            </w:pPr>
-            <w:r>
-              <w:rPr>
-                <w:rFonts w:ascii="Consolas" w:hAnsi="Consolas" w:eastAsia="Consolas"/>
-                <w:color w:val="F2F2F2"/>
-                <w:sz w:val="19"/>
-              </w:rPr>
-              <w:t>SYS@boston&gt; select count(*) dg_err from v$dataguard_status</w:t>
-            </w:r>
-          </w:p>
-          <w:p>
-            <w:pPr>
-              <w:spacing w:after="0" w:before="0"/>
-            </w:pPr>
-            <w:r>
-              <w:rPr>
-                <w:rFonts w:ascii="Consolas" w:hAnsi="Consolas" w:eastAsia="Consolas"/>
-                <w:color w:val="F2F2F2"/>
-                <w:sz w:val="19"/>
-              </w:rPr>
-              <w:t xml:space="preserve">  2            where error_code&lt;&gt;0 and timestamp&gt;sysdate-1/24;</w:t>
-            </w:r>
-          </w:p>
-          <w:p>
-            <w:pPr>
-              <w:spacing w:after="0" w:before="0"/>
-            </w:pPr>
-            <w:r>
-              <w:rPr>
-                <w:rFonts w:ascii="Consolas" w:hAnsi="Consolas" w:eastAsia="Consolas"/>
-                <w:color w:val="F2F2F2"/>
-                <w:sz w:val="19"/>
-              </w:rPr>
-              <w:t xml:space="preserve"> </w:t>
-            </w:r>
-          </w:p>
-          <w:p>
-            <w:pPr>
-              <w:spacing w:after="0" w:before="0"/>
-            </w:pPr>
-            <w:r>
-              <w:rPr>
-                <w:rFonts w:ascii="Consolas" w:hAnsi="Consolas" w:eastAsia="Consolas"/>
-                <w:color w:val="F2F2F2"/>
-                <w:sz w:val="19"/>
-              </w:rPr>
-              <w:t>SRL_ACTIVE     GAP_CNT      DG_ERR</w:t>
-            </w:r>
-          </w:p>
-          <w:p>
-            <w:pPr>
-              <w:spacing w:after="0" w:before="0"/>
-            </w:pPr>
-            <w:r>
-              <w:rPr>
-                <w:rFonts w:ascii="Consolas" w:hAnsi="Consolas" w:eastAsia="Consolas"/>
-                <w:color w:val="F2F2F2"/>
-                <w:sz w:val="19"/>
-              </w:rPr>
-              <w:t>----------  ----------  ----------</w:t>
-            </w:r>
-          </w:p>
-          <w:p>
-            <w:pPr>
-              <w:spacing w:after="0" w:before="0"/>
-            </w:pPr>
-            <w:r>
-              <w:rPr>
-                <w:rFonts w:ascii="Consolas" w:hAnsi="Consolas" w:eastAsia="Consolas"/>
-                <w:color w:val="F2F2F2"/>
-                <w:sz w:val="19"/>
-              </w:rPr>
-              <w:t xml:space="preserve">         1           0           0</w:t>
+              <w:t xml:space="preserve">   --&gt; SRL_ACTIVE 1 / GAP_CNT 0 / DG_ERR 0</w:t>
             </w:r>
           </w:p>
         </w:tc>
@@ -9259,7 +9138,7 @@
           <w:rFonts w:ascii="맑은 고딕" w:hAnsi="맑은 고딕" w:eastAsia="맑은 고딕"/>
           <w:sz w:val="21"/>
         </w:rPr>
-        <w:t>**`SRL_ACTIVE`가 이 점검표의 핵심**이다. 전송이 끊기면 두 지연은 0인데 이 값이 0이 된다. **지연으로는 못 잡는 것을 이 값이 잡는다.** `MRP0`의 `SEQUENCE#`를 Primary의 `CUR_SEQ`와 비교하는 것도 마찬가지다.</w:t>
+        <w:t>**`SRL_ACTIVE`가 이 점검표의 핵심**이다. 전송이 끊기면 두 지연은 0인데 이 값이 0이 된다.</w:t>
       </w:r>
     </w:p>
     <w:tbl>
@@ -9296,7 +9175,7 @@
                 <w:rFonts w:ascii="맑은 고딕" w:hAnsi="맑은 고딕" w:eastAsia="맑은 고딕"/>
                 <w:sz w:val="20"/>
               </w:rPr>
-              <w:t>이 장에서 두 번 확인했다. 14장에서는 속성으로 껐을 때, 15장에서는 리스너를 내렸을 때 — **두 경우 모두 지연이 0이었다.**</w:t>
+              <w:t>14장에서는 속성으로 껐을 때, 15장에서는 리스너를 내렸을 때 — **두 경우 모두 지연이 0이었다.** 그러므로 지연은 **보조 지표**로 두고, 주 지표는 흐름 자체가 있는지 보는 것들로 한다.</w:t>
             </w:r>
           </w:p>
           <w:p>
@@ -9308,7 +9187,7 @@
                 <w:rFonts w:ascii="맑은 고딕" w:hAnsi="맑은 고딕" w:eastAsia="맑은 고딕"/>
                 <w:sz w:val="20"/>
               </w:rPr>
-              <w:t>그러므로 점검표에서 지연은 **보조 지표**로 둔다. 주 지표는 흐름 자체가 있는지 확인하는 것들이다.</w:t>
+              <w:t>**주 지표** — `SRL_ACTIVE`가 1인가, `MRP0`가 있는가, 두 `SEQUENCE#`가 같은가, 목적지 `STATUS`가 `VALID`인가.</w:t>
             </w:r>
           </w:p>
           <w:p>
@@ -9320,31 +9199,7 @@
                 <w:rFonts w:ascii="맑은 고딕" w:hAnsi="맑은 고딕" w:eastAsia="맑은 고딕"/>
                 <w:sz w:val="20"/>
               </w:rPr>
-              <w:t>**주 지표** — `SRL_ACTIVE`가 1인가, `MRP0`가 있는가, 두 `SEQUENCE#`가 같은가, 목적지 `STATUS`가 `VALID`인가.</w:t>
-            </w:r>
-          </w:p>
-          <w:p>
-            <w:pPr>
-              <w:spacing w:after="20"/>
-            </w:pPr>
-            <w:r>
-              <w:rPr>
-                <w:rFonts w:ascii="맑은 고딕" w:hAnsi="맑은 고딕" w:eastAsia="맑은 고딕"/>
-                <w:sz w:val="20"/>
-              </w:rPr>
-              <w:t>**보조 지표** — `transport lag`, `apply lag`. 흐르고는 있는데 느린 상황을 잡는다.</w:t>
-            </w:r>
-          </w:p>
-          <w:p>
-            <w:pPr>
-              <w:spacing w:after="20"/>
-            </w:pPr>
-            <w:r>
-              <w:rPr>
-                <w:rFonts w:ascii="맑은 고딕" w:hAnsi="맑은 고딕" w:eastAsia="맑은 고딕"/>
-                <w:sz w:val="20"/>
-              </w:rPr>
-              <w:t>두 종류를 함께 두면 "끊겼다"와 "느리다"를 구별할 수 있다.</w:t>
+              <w:t>**보조 지표** — `transport lag`, `apply lag`. 흐르는데 느린 상황을 잡는다. 둘을 함께 두면 "끊겼다"와 "느리다"를 구별할 수 있다.</w:t>
             </w:r>
           </w:p>
         </w:tc>
@@ -9356,7 +9211,7 @@
         <w:pStyle w:val="Heading3"/>
       </w:pPr>
       <w:r>
-        <w:t>15.6.4  판정 규칙</w:t>
+        <w:t>15.7.4  판정 규칙</w:t>
       </w:r>
     </w:p>
     <w:tbl>
@@ -9568,7 +9423,7 @@
                 <w:rFonts w:ascii="맑은 고딕" w:hAnsi="맑은 고딕" w:eastAsia="맑은 고딕"/>
                 <w:sz w:val="20"/>
               </w:rPr>
-              <w:t>**자동화하기 쉬운 것** — 지금까지 본 SQL은 전부 숫자나 짧은 문자열을 낸다. 5분마다 돌리고 판정 규칙을 적용하면 된다.</w:t>
+              <w:t>**쉬운 것** — 지금까지 본 SQL은 전부 숫자나 짧은 문자열을 낸다. 5분마다 돌리고 판정 규칙을 적용한다.</w:t>
             </w:r>
           </w:p>
           <w:p>
@@ -9580,7 +9435,7 @@
                 <w:rFonts w:ascii="맑은 고딕" w:hAnsi="맑은 고딕" w:eastAsia="맑은 고딕"/>
                 <w:sz w:val="20"/>
               </w:rPr>
-              <w:t>**자동화하기 어려운 것** — 14장의 `VALIDATE DATABASE`다. 출력이 문장과 표라 파싱이 번거로워 자주 빠진다.</w:t>
+              <w:t>**어려운 것** — 14장의 `VALIDATE DATABASE`. 출력이 문장과 표라 파싱이 번거로우며, **타협안**은 `dgmgrl ... | grep 'Ready for Switchover'` 한 줄이다.</w:t>
             </w:r>
           </w:p>
           <w:p>
@@ -9592,31 +9447,7 @@
                 <w:rFonts w:ascii="맑은 고딕" w:hAnsi="맑은 고딕" w:eastAsia="맑은 고딕"/>
                 <w:sz w:val="20"/>
               </w:rPr>
-              <w:t>**타협안** — `dgmgrl ... | grep 'Ready for Switchover'` 한 줄이면 14장에서 실측한 함정을 잡을 수 있다.</w:t>
-            </w:r>
-          </w:p>
-          <w:p>
-            <w:pPr>
-              <w:spacing w:after="20"/>
-            </w:pPr>
-            <w:r>
-              <w:rPr>
-                <w:rFonts w:ascii="맑은 고딕" w:hAnsi="맑은 고딕" w:eastAsia="맑은 고딕"/>
-                <w:sz w:val="20"/>
-              </w:rPr>
-              <w:t>**기록의 가치** — 값을 기록하면 기준선이 생긴다. **점검의 목적은 이상을 잡는 것만이 아니라 정상을 아는 것**이다. 5분마다 SQL 점검, 하루 한 번 `VALIDATE`, 주 1회 사람이 전체를 읽는 세 층으로 짠다.</w:t>
-            </w:r>
-          </w:p>
-          <w:p>
-            <w:pPr>
-              <w:spacing w:after="20"/>
-            </w:pPr>
-            <w:r>
-              <w:rPr>
-                <w:rFonts w:ascii="맑은 고딕" w:hAnsi="맑은 고딕" w:eastAsia="맑은 고딕"/>
-                <w:sz w:val="20"/>
-              </w:rPr>
-              <w:t>**하지 말 것** — 점검 계정에 과한 권한을 주는 것이다. 개별 `V_$` 뷰 권한으로 충분하며 SYSDBA 상시 접속은 위험하다.</w:t>
+              <w:t>**기록의 가치** — **점검의 목적은 이상을 잡는 것만이 아니라 정상을 아는 것**이다. 5분마다 SQL 점검, 하루 한 번 `VALIDATE`, 주 1회 사람이 읽는 세 층으로 짜고, 점검 계정에는 개별 `V_$` 뷰 권한만 준다.</w:t>
             </w:r>
           </w:p>
         </w:tc>
@@ -9657,7 +9488,7 @@
                 <w:rFonts w:ascii="맑은 고딕" w:hAnsi="맑은 고딕" w:eastAsia="맑은 고딕"/>
                 <w:sz w:val="20"/>
               </w:rPr>
-              <w:t>모두 이 장의 실측이다. "정상", "조치 필요", "판단 보류" 중 하나로 답하고 근거를 말해 보라.</w:t>
+              <w:t>모두 이 장의 실측이다. "정상"·"조치 필요"·"판단 보류" 중 하나로 답하고 근거를 말해 보라.</w:t>
             </w:r>
           </w:p>
           <w:p>
@@ -9669,7 +9500,7 @@
                 <w:rFonts w:ascii="맑은 고딕" w:hAnsi="맑은 고딕" w:eastAsia="맑은 고딕"/>
                 <w:sz w:val="20"/>
               </w:rPr>
-              <w:t>**①** Standby의 `V$LOG`에서 세 그룹의 `SEQUENCE#`가 모두 0이다. **②** Primary의 `V$STANDBY_LOG` 네 그룹이 전부 `UNASSIGNED`다.</w:t>
+              <w:t>**①** Standby의 `V$LOG`에서 `SEQUENCE#`가 모두 0이다. **②** `dest_id=1` 행의 `APPLIED`가 전부 `NO`다.</w:t>
             </w:r>
           </w:p>
           <w:p>
@@ -9681,7 +9512,7 @@
                 <w:rFonts w:ascii="맑은 고딕" w:hAnsi="맑은 고딕" w:eastAsia="맑은 고딕"/>
                 <w:sz w:val="20"/>
               </w:rPr>
-              <w:t>**③** `V$ARCHIVED_LOG`에서 `dest_id=1` 행의 `APPLIED`가 전부 `NO`다. **④** Standby의 `APPLIED_SEQ#`가 0이고 `RECOVERY_MODE`는 `MANAGED REAL TIME APPLY`다.</w:t>
+              <w:t>**③** Standby의 `APPLIED_SEQ#`가 0이고 `RECOVERY_MODE`는 `MANAGED REAL TIME APPLY`다. **④** `VALID_NOW`가 `UNKNOWN`인 목적지가 29개다.</w:t>
             </w:r>
           </w:p>
           <w:p>
@@ -9693,7 +9524,7 @@
                 <w:rFonts w:ascii="맑은 고딕" w:hAnsi="맑은 고딕" w:eastAsia="맑은 고딕"/>
                 <w:sz w:val="20"/>
               </w:rPr>
-              <w:t>**⑤** `VALID_NOW`가 `UNKNOWN`인 목적지가 29개다. **⑥** 두 지연이 모두 0인데 `SRL_ACTIVE`가 0이다.</w:t>
+              <w:t>**⑤** 두 지연이 모두 0인데 `SRL_ACTIVE`가 0이다. **⑥** 리스너를 올린 지 3분인데 `ORA-12541`이 그대로다. **⑦** Logical Standby에서 `V$DATAGUARD_STATS`가 `no rows selected`다.</w:t>
             </w:r>
           </w:p>
           <w:p>
@@ -9705,7 +9536,7 @@
                 <w:rFonts w:ascii="맑은 고딕" w:hAnsi="맑은 고딕" w:eastAsia="맑은 고딕"/>
                 <w:sz w:val="20"/>
               </w:rPr>
-              <w:t>**⑦** 리스너를 올린 지 3분인데 `ERROR` 열에 `ORA-12541`이 그대로 있다. **⑧** 조치를 마쳤는데 `SHOW CONFIGURATION`이 `ERROR`이고 `status updated 58 seconds ago`다.</w:t>
+              <w:t>판정 — ①정상 ②정상(`dest_id=2`를 봐야 한다) ③정상(실시간 적용은 SRL에서 읽는다) ④정상(쓰지 않는 목적지다) ⑤**조치 필요** ⑥**판단 보류**(`ReopenSecs` 300) ⑦정상(SQL Apply는 이 뷰를 채우지 않는다).</w:t>
             </w:r>
           </w:p>
           <w:p>
@@ -9717,19 +9548,7 @@
                 <w:rFonts w:ascii="맑은 고딕" w:hAnsi="맑은 고딕" w:eastAsia="맑은 고딕"/>
                 <w:sz w:val="20"/>
               </w:rPr>
-              <w:t>판정 — ①정상(온라인 리두를 쓰지 않는다) ②정상(전환 후를 위해 있다) ③정상(`dest_id=2`를 봐야 한다) ④정상(실시간 적용은 SRL에서 읽는다) ⑤정상(쓰지 않는 목적지다) ⑥**조치 필요**(지연은 0인데 리두가 오지 않는다) ⑦**판단 보류**(`ReopenSecs` 300이므로 4~5분까지 기다린다) ⑧**판단 보류**(판정 시차다. SQL 뷰가 이미 `VALID`라면 회복된 것이다).</w:t>
-            </w:r>
-          </w:p>
-          <w:p>
-            <w:pPr>
-              <w:spacing w:after="20"/>
-            </w:pPr>
-            <w:r>
-              <w:rPr>
-                <w:rFonts w:ascii="맑은 고딕" w:hAnsi="맑은 고딕" w:eastAsia="맑은 고딕"/>
-                <w:sz w:val="20"/>
-              </w:rPr>
-              <w:t>여덟 중 다섯이 정상이고 둘이 판단 보류다. **뷰의 값을 곧바로 이상 신호로 읽지 않는 것**이 이 장의 태도다.</w:t>
+              <w:t>일곱 중 다섯이 정상이고 하나가 판단 보류다. **뷰의 값을 곧바로 이상 신호로 읽지 않는 것**이 이 장의 태도다.</w:t>
             </w:r>
           </w:p>
         </w:tc>
@@ -9741,7 +9560,7 @@
         <w:pStyle w:val="Heading2"/>
       </w:pPr>
       <w:r>
-        <w:t>15.7  요약</w:t>
+        <w:t>15.8  요약</w:t>
       </w:r>
     </w:p>
     <w:p>
@@ -9753,7 +9572,7 @@
           <w:rFonts w:ascii="맑은 고딕" w:hAnsi="맑은 고딕" w:eastAsia="맑은 고딕"/>
           <w:sz w:val="21"/>
         </w:rPr>
-        <w:t>`V$LOG`의 `CURRENT`는 하나여야 하고 그 그룹만 `ARCHIVED=NO`인 것이 정상이다. `V$LOGFILE`의 `STATUS`는 **비어 있는 것이 정상**이다.</w:t>
+        <w:t>`V$LOG`의 `CURRENT`는 하나여야 하고 그 그룹만 `ARCHIVED=NO`인 것이 정상, `V$LOGFILE`의 `STATUS`는 **비어 있는 것이 정상**이다.</w:t>
       </w:r>
     </w:p>
     <w:p>
@@ -9765,7 +9584,7 @@
           <w:rFonts w:ascii="맑은 고딕" w:hAnsi="맑은 고딕" w:eastAsia="맑은 고딕"/>
           <w:sz w:val="21"/>
         </w:rPr>
-        <w:t>**Standby의 온라인 리두는 `SEQUENCE#`가 0**이며 Primary의 SRL은 전부 `UNASSIGNED`다. **뷰가 조회된다고 값이 있는 것이 아니다.**</w:t>
+        <w:t>**Standby의 온라인 리두는 `SEQUENCE#`가 0**이며 Primary의 SRL은 전부 `UNASSIGNED`다. **뷰가 조회된다고 값이 있는 것이 아니다.** SRL은 **`ACTIVE`가 정확히 하나**여야 하고 그 `SEQUENCE#`가 Primary의 현재 시퀀스와 같아야 한다.</w:t>
       </w:r>
     </w:p>
     <w:p>
@@ -9777,7 +9596,7 @@
           <w:rFonts w:ascii="맑은 고딕" w:hAnsi="맑은 고딕" w:eastAsia="맑은 고딕"/>
           <w:sz w:val="21"/>
         </w:rPr>
-        <w:t>SRL은 **`ACTIVE`가 정확히 하나**여야 하고 그 `SEQUENCE#`가 Primary의 현재 시퀀스와 같아야 한다.</w:t>
+        <w:t>`V$ARCHIVE_DEST`는 **설정**을 `_STATUS`는 **지금 상태**를 보며, `V$MANAGED_STANDBY`에서 **`RFS(LGWR)`와 `MRP0`의 `SEQUENCE#`·`BLOCK#`이 같으면** 실시간 적용 중이다.</w:t>
       </w:r>
     </w:p>
     <w:p>
@@ -9789,7 +9608,7 @@
           <w:rFonts w:ascii="맑은 고딕" w:hAnsi="맑은 고딕" w:eastAsia="맑은 고딕"/>
           <w:sz w:val="21"/>
         </w:rPr>
-        <w:t>`V$ARCHIVE_DEST`는 **설정**을, `_STATUS`는 **지금 상태**를 본다.</w:t>
+        <w:t>`V$ARCHIVED_LOG`의 `APPLIED`는 **`dest_id=2`만 의미가 있고** `APPLIED_SEQ#`가 0인 것도 정상이다.</w:t>
       </w:r>
     </w:p>
     <w:p>
@@ -9801,7 +9620,7 @@
           <w:rFonts w:ascii="맑은 고딕" w:hAnsi="맑은 고딕" w:eastAsia="맑은 고딕"/>
           <w:sz w:val="21"/>
         </w:rPr>
-        <w:t>`V$MANAGED_STANDBY`에서 **`RFS(LGWR)`와 `MRP0`의 `SEQUENCE#`·`BLOCK#`이 같으면** 실시간 적용 중이다.</w:t>
+        <w:t>리스너를 내리면 `STATUS=ERROR`, `VALID_NOW=INACTIVE`, `ERROR=ORA-12541`이고 그때도 **두 지연은 0**이었다. `LOG_ARCHIVE_DEST_STATE_2`는 `ENABLE` 그대로여서 **`RESET`(Broker)·`DEFER`(사람)와 구별된다.**</w:t>
       </w:r>
     </w:p>
     <w:p>
@@ -9813,7 +9632,7 @@
           <w:rFonts w:ascii="맑은 고딕" w:hAnsi="맑은 고딕" w:eastAsia="맑은 고딕"/>
           <w:sz w:val="21"/>
         </w:rPr>
-        <w:t>`V$ARCHIVED_LOG`의 `APPLIED`는 **`dest_id=2`만 의미가 있고**, `APPLIED_SEQ#`가 0인 것도 정상이다. **실시간 적용은 SRL에서 읽는다.**</w:t>
+        <w:t>알림 로그에는 **접속 문자열·프로세스·트레이스 파일 이름**이 있고, `archiver continuing`이므로 Primary는 멈추지 않는다.</w:t>
       </w:r>
     </w:p>
     <w:p>
@@ -9825,7 +9644,7 @@
           <w:rFonts w:ascii="맑은 고딕" w:hAnsi="맑은 고딕" w:eastAsia="맑은 고딕"/>
           <w:sz w:val="21"/>
         </w:rPr>
-        <w:t>리스너를 내리면 `STATUS=ERROR`, `VALID_NOW=INACTIVE`, `ERROR=ORA-12541`. 그때도 **두 지연은 0**이었다.</w:t>
+        <w:t>Broker는 **ORA-16857**로 경보했고, 리스너를 올려도 재개까지 **약 4~5분**(`ReopenSecs` 300) 걸렸다.</w:t>
       </w:r>
     </w:p>
     <w:p>
@@ -9837,7 +9656,7 @@
           <w:rFonts w:ascii="맑은 고딕" w:hAnsi="맑은 고딕" w:eastAsia="맑은 고딕"/>
           <w:sz w:val="21"/>
         </w:rPr>
-        <w:t>그때 `LOG_ARCHIVE_DEST_STATE_2`는 `ENABLE` 그대로였다. **`RESET`(Broker)·`DEFER`(사람)와 구별된다.**</w:t>
+        <w:t>Standby에서는 **`MRP0`가 `WAIT_FOR_LOG`가 되고 `RFS(LGWR)`가 사라진다.** 조치 직후의 `ERROR`는 **판정의 시차**다.</w:t>
       </w:r>
     </w:p>
     <w:p>
@@ -9849,43 +9668,7 @@
           <w:rFonts w:ascii="맑은 고딕" w:hAnsi="맑은 고딕" w:eastAsia="맑은 고딕"/>
           <w:sz w:val="21"/>
         </w:rPr>
-        <w:t>알림 로그에는 **접속 문자열·프로세스·트레이스 파일 이름**이 있다. `archiver continuing` — MaxPerformance이므로 Primary는 멈추지 않는다.</w:t>
-      </w:r>
-    </w:p>
-    <w:p>
-      <w:pPr>
-        <w:pStyle w:val="ListBullet"/>
-      </w:pPr>
-      <w:r>
-        <w:rPr>
-          <w:rFonts w:ascii="맑은 고딕" w:hAnsi="맑은 고딕" w:eastAsia="맑은 고딕"/>
-          <w:sz w:val="21"/>
-        </w:rPr>
-        <w:t>Broker는 **ORA-16857**로 경보했다. 임계값이 있는 항목이기 때문이다. 리스너를 올려도 재개까지 **약 4~5분** 걸렸다. `ReopenSecs` 300 때문이다.</w:t>
-      </w:r>
-    </w:p>
-    <w:p>
-      <w:pPr>
-        <w:pStyle w:val="ListBullet"/>
-      </w:pPr>
-      <w:r>
-        <w:rPr>
-          <w:rFonts w:ascii="맑은 고딕" w:hAnsi="맑은 고딕" w:eastAsia="맑은 고딕"/>
-          <w:sz w:val="21"/>
-        </w:rPr>
-        <w:t>Standby에서는 **`MRP0`가 `WAIT_FOR_LOG`가 되고 `RFS(LGWR)`가 사라진다.** 조치 직후 Broker가 `ERROR`로 보인 것은 **판정의 시차**다.</w:t>
-      </w:r>
-    </w:p>
-    <w:p>
-      <w:pPr>
-        <w:pStyle w:val="ListBullet"/>
-      </w:pPr>
-      <w:r>
-        <w:rPr>
-          <w:rFonts w:ascii="맑은 고딕" w:hAnsi="맑은 고딕" w:eastAsia="맑은 고딕"/>
-          <w:sz w:val="21"/>
-        </w:rPr>
-        <w:t>`LOG_ARCHIVE_TRACE`는 **비트마스크**다. 12는 `4+8`, 잘못된 값은 **ORA-02017**. 실시간 전송은 **`TTnn`** 파일에 남는다(실측 664KB).</w:t>
+        <w:t>`LOG_ARCHIVE_TRACE`는 **비트마스크**이며 잘못된 값은 **ORA-02017**이다. 실시간 전송은 **`TTnn`** 파일에 남는다(664KB).</w:t>
       </w:r>
     </w:p>
     <w:p>
@@ -9902,10 +9685,34 @@
     </w:p>
     <w:p>
       <w:pPr>
+        <w:pStyle w:val="ListBullet"/>
+      </w:pPr>
+      <w:r>
+        <w:rPr>
+          <w:rFonts w:ascii="맑은 고딕" w:hAnsi="맑은 고딕" w:eastAsia="맑은 고딕"/>
+          <w:sz w:val="21"/>
+        </w:rPr>
+        <w:t>**Logical Standby에서는 `V$MANAGED_STANDBY`에 `MRP0`가 없고 `V$DATAGUARD_STATS`가 `no rows`다.** 판정은 `V$LOGSTDBY_STATE`와 `DBA_LOGSTDBY_PROGRESS`의 세 SCN으로 한다.</w:t>
+      </w:r>
+    </w:p>
+    <w:p>
+      <w:pPr>
+        <w:pStyle w:val="ListBullet"/>
+      </w:pPr>
+      <w:r>
+        <w:rPr>
+          <w:rFonts w:ascii="맑은 고딕" w:hAnsi="맑은 고딕" w:eastAsia="맑은 고딕"/>
+          <w:sz w:val="21"/>
+        </w:rPr>
+        <w:t>`V$LOGSTDBY_TRANSACTION`의 열은 전부 **`PRIMARY_` 접두어**이며 **적용이 도는 동안에만** 채워진다. 멈춘 뒤의 XID는 `DBA_LOGSTDBY_EVENTS`에서 찾는다.</w:t>
+      </w:r>
+    </w:p>
+    <w:p>
+      <w:pPr>
         <w:pStyle w:val="Heading2"/>
       </w:pPr>
       <w:r>
-        <w:t>15.8  퀴즈</w:t>
+        <w:t>15.9  퀴즈</w:t>
       </w:r>
     </w:p>
     <w:p>
@@ -9994,10 +9801,22 @@
     </w:p>
     <w:p>
       <w:pPr>
+        <w:pStyle w:val="ListBullet"/>
+      </w:pPr>
+      <w:r>
+        <w:rPr>
+          <w:rFonts w:ascii="맑은 고딕" w:hAnsi="맑은 고딕" w:eastAsia="맑은 고딕"/>
+          <w:sz w:val="21"/>
+        </w:rPr>
+        <w:t>Logical Standby에서 `V$DATAGUARD_STATS`가 비는 이유와, 그때 지연 대신 볼 지표를 답하라.</w:t>
+      </w:r>
+    </w:p>
+    <w:p>
+      <w:pPr>
         <w:pStyle w:val="Heading2"/>
       </w:pPr>
       <w:r>
-        <w:t>15.9  실습 개요</w:t>
+        <w:t>15.10  실습 개요</w:t>
       </w:r>
     </w:p>
     <w:p>
@@ -10073,12 +9892,24 @@
       </w:r>
     </w:p>
     <w:p>
+      <w:pPr>
+        <w:pStyle w:val="ListBullet"/>
+      </w:pPr>
       <w:r>
         <w:rPr>
           <w:rFonts w:ascii="맑은 고딕" w:hAnsi="맑은 고딕" w:eastAsia="맑은 고딕"/>
           <w:sz w:val="21"/>
         </w:rPr>
-        <w:t>실습 03은 **실제로 장애를 만든다.** 데이터에는 영향이 없지만 복구에 `ReopenSecs` 만큼 기다려야 하므로 시간을 넉넉히 잡는다. 실습 05는 `SCOPE=BOTH`로 저장되므로 **반드시 0으로 되돌린 것을 확인하고 끝낸다.**</w:t>
+        <w:t>실습 07 — Logical Standby 모니터링: `V$LOGSTDBY_TRANSACTION`으로 적용 중인 트랜잭션을 추적하고, 멈춘 적용을 진단해 되살린다.</w:t>
+      </w:r>
+    </w:p>
+    <w:p>
+      <w:r>
+        <w:rPr>
+          <w:rFonts w:ascii="맑은 고딕" w:hAnsi="맑은 고딕" w:eastAsia="맑은 고딕"/>
+          <w:sz w:val="21"/>
+        </w:rPr>
+        <w:t>실습 03은 **실제로 장애를 만든다.** 복구에 `ReopenSecs` 만큼 기다려야 하므로 시간을 넉넉히 잡는다. 실습 05는 `SCOPE=BOTH`로 저장되므로 **반드시 0으로 되돌린 것을 확인하고 끝낸다.** 실습 07은 **되돌릴 수 없는 전환**을 포함하므로 반드시 스냅샷을 먼저 뜬다.</w:t>
       </w:r>
     </w:p>
     <w:sectPr>

</xml_diff>